<commit_message>
Spring boot addtions and weekly assignment
</commit_message>
<xml_diff>
--- a/Capgemini-Training/Capg-AdvJava-Training/Sprint1-Evaluation-Satakratu.docx
+++ b/Capgemini-Training/Capg-AdvJava-Training/Sprint1-Evaluation-Satakratu.docx
@@ -14,6 +14,16 @@
           <w:szCs w:val="27"/>
         </w:rPr>
       </w:pPr>
+      <w:r>
+        <w:rPr>
+          <w:rFonts w:ascii="Courier New" w:eastAsia="Times New Roman" w:hAnsi="Courier New" w:cs="Courier New"/>
+          <w:b/>
+          <w:bCs/>
+          <w:sz w:val="20"/>
+          <w:szCs w:val="20"/>
+        </w:rPr>
+        <w:t xml:space="preserve"> </w:t>
+      </w:r>
       <w:r>
         <w:rPr>
           <w:rFonts w:ascii="Courier New" w:eastAsia="Times New Roman" w:hAnsi="Courier New" w:cs="Courier New"/>
@@ -577,7 +587,7 @@
           <w:szCs w:val="24"/>
         </w:rPr>
         <w:pict>
-          <v:rect id="_x0000_i1027" style="width:0;height:1.5pt" o:hralign="center" o:hrstd="t" o:hr="t" fillcolor="#a0a0a0" stroked="f"/>
+          <v:rect id="_x0000_i1026" style="width:0;height:1.5pt" o:hralign="center" o:hrstd="t" o:hr="t" fillcolor="#a0a0a0" stroked="f"/>
         </w:pict>
       </w:r>
     </w:p>
@@ -709,7 +719,7 @@
           <w:szCs w:val="24"/>
         </w:rPr>
         <w:pict>
-          <v:rect id="_x0000_i1028" style="width:0;height:1.5pt" o:hralign="center" o:hrstd="t" o:hr="t" fillcolor="#a0a0a0" stroked="f"/>
+          <v:rect id="_x0000_i1027" style="width:0;height:1.5pt" o:hralign="center" o:hrstd="t" o:hr="t" fillcolor="#a0a0a0" stroked="f"/>
         </w:pict>
       </w:r>
     </w:p>
@@ -863,7 +873,7 @@
           <w:szCs w:val="24"/>
         </w:rPr>
         <w:pict>
-          <v:rect id="_x0000_i1029" style="width:0;height:1.5pt" o:hralign="center" o:hrstd="t" o:hr="t" fillcolor="#a0a0a0" stroked="f"/>
+          <v:rect id="_x0000_i1028" style="width:0;height:1.5pt" o:hralign="center" o:hrstd="t" o:hr="t" fillcolor="#a0a0a0" stroked="f"/>
         </w:pict>
       </w:r>
     </w:p>
@@ -981,7 +991,7 @@
           <w:szCs w:val="24"/>
         </w:rPr>
         <w:pict>
-          <v:rect id="_x0000_i1030" style="width:0;height:1.5pt" o:hralign="center" o:hrstd="t" o:hr="t" fillcolor="#a0a0a0" stroked="f"/>
+          <v:rect id="_x0000_i1029" style="width:0;height:1.5pt" o:hralign="center" o:hrstd="t" o:hr="t" fillcolor="#a0a0a0" stroked="f"/>
         </w:pict>
       </w:r>
     </w:p>
@@ -1234,7 +1244,7 @@
           <w:szCs w:val="24"/>
         </w:rPr>
         <w:pict>
-          <v:rect id="_x0000_i1031" style="width:0;height:1.5pt" o:hralign="center" o:hrstd="t" o:hr="t" fillcolor="#a0a0a0" stroked="f"/>
+          <v:rect id="_x0000_i1030" style="width:0;height:1.5pt" o:hralign="center" o:hrstd="t" o:hr="t" fillcolor="#a0a0a0" stroked="f"/>
         </w:pict>
       </w:r>
     </w:p>
@@ -1289,13 +1299,7 @@
         <w:rPr>
           <w:b/>
         </w:rPr>
-        <w:t>Diff b/w Implements Controller and @Controller</w:t>
-      </w:r>
-      <w:r>
-        <w:rPr>
-          <w:b/>
-        </w:rPr>
-        <w:t>:</w:t>
+        <w:t>Diff b/w Implements Controller and @Controller:</w:t>
       </w:r>
     </w:p>
     <w:p>
@@ -1319,7 +1323,7 @@
           <w:szCs w:val="24"/>
         </w:rPr>
         <w:pict>
-          <v:rect id="_x0000_i1032" style="width:0;height:1.5pt" o:hralign="center" o:hrstd="t" o:hr="t" fillcolor="#a0a0a0" stroked="f"/>
+          <v:rect id="_x0000_i1031" style="width:0;height:1.5pt" o:hralign="center" o:hrstd="t" o:hr="t" fillcolor="#a0a0a0" stroked="f"/>
         </w:pict>
       </w:r>
     </w:p>
@@ -1566,7 +1570,7 @@
           <w:szCs w:val="24"/>
         </w:rPr>
         <w:pict>
-          <v:rect id="_x0000_i1033" style="width:0;height:1.5pt" o:hralign="center" o:hrstd="t" o:hr="t" fillcolor="#a0a0a0" stroked="f"/>
+          <v:rect id="_x0000_i1032" style="width:0;height:1.5pt" o:hralign="center" o:hrstd="t" o:hr="t" fillcolor="#a0a0a0" stroked="f"/>
         </w:pict>
       </w:r>
     </w:p>
@@ -1637,7 +1641,7 @@
           <w:szCs w:val="24"/>
         </w:rPr>
         <w:pict>
-          <v:rect id="_x0000_i1034" style="width:0;height:1.5pt" o:hralign="center" o:hrstd="t" o:hr="t" fillcolor="#a0a0a0" stroked="f"/>
+          <v:rect id="_x0000_i1033" style="width:0;height:1.5pt" o:hralign="center" o:hrstd="t" o:hr="t" fillcolor="#a0a0a0" stroked="f"/>
         </w:pict>
       </w:r>
     </w:p>
@@ -1715,7 +1719,7 @@
           <w:szCs w:val="24"/>
         </w:rPr>
         <w:pict>
-          <v:rect id="_x0000_i1035" style="width:0;height:1.5pt" o:hralign="center" o:hrstd="t" o:hr="t" fillcolor="#a0a0a0" stroked="f"/>
+          <v:rect id="_x0000_i1034" style="width:0;height:1.5pt" o:hralign="center" o:hrstd="t" o:hr="t" fillcolor="#a0a0a0" stroked="f"/>
         </w:pict>
       </w:r>
     </w:p>
@@ -2053,7 +2057,6 @@
           <w:szCs w:val="20"/>
         </w:rPr>
       </w:pPr>
-      <w:bookmarkStart w:id="0" w:name="_GoBack"/>
       <w:r>
         <w:rPr>
           <w:rFonts w:ascii="Consolas" w:hAnsi="Consolas"/>
@@ -2266,7 +2269,6 @@
         </w:rPr>
         <w:t>){</w:t>
       </w:r>
-      <w:bookmarkEnd w:id="0"/>
     </w:p>
     <w:p>
       <w:pPr>
@@ -2336,7 +2338,6 @@
         <w:t>=</w:t>
       </w:r>
       <w:proofErr w:type="spellStart"/>
-      <w:proofErr w:type="gramStart"/>
       <w:r>
         <w:rPr>
           <w:rFonts w:ascii="Consolas" w:hAnsi="Consolas"/>
@@ -2365,7 +2366,6 @@
         <w:t>getForObject</w:t>
       </w:r>
       <w:proofErr w:type="spellEnd"/>
-      <w:proofErr w:type="gramEnd"/>
       <w:r>
         <w:rPr>
           <w:rFonts w:ascii="Consolas" w:hAnsi="Consolas"/>
@@ -2517,7 +2517,6 @@
         <w:t>=</w:t>
       </w:r>
       <w:proofErr w:type="spellStart"/>
-      <w:proofErr w:type="gramStart"/>
       <w:r>
         <w:rPr>
           <w:rFonts w:ascii="Consolas" w:hAnsi="Consolas"/>
@@ -2546,7 +2545,6 @@
         <w:t>getForObject</w:t>
       </w:r>
       <w:proofErr w:type="spellEnd"/>
-      <w:proofErr w:type="gramEnd"/>
       <w:r>
         <w:rPr>
           <w:rFonts w:ascii="Consolas" w:hAnsi="Consolas"/>
@@ -2806,7 +2804,6 @@
         </w:rPr>
         <w:t>(</w:t>
       </w:r>
-      <w:proofErr w:type="gramStart"/>
       <w:r>
         <w:rPr>
           <w:rFonts w:ascii="Consolas" w:hAnsi="Consolas"/>
@@ -2834,7 +2831,6 @@
         </w:rPr>
         <w:t>info</w:t>
       </w:r>
-      <w:proofErr w:type="gramEnd"/>
       <w:r>
         <w:rPr>
           <w:rFonts w:ascii="Consolas" w:hAnsi="Consolas"/>
@@ -2977,15 +2973,7 @@
       </w:r>
       <w:proofErr w:type="spellEnd"/>
       <w:r>
-        <w:t xml:space="preserve"> -&gt; Is used </w:t>
-      </w:r>
-      <w:proofErr w:type="gramStart"/>
-      <w:r>
-        <w:t>In</w:t>
-      </w:r>
-      <w:proofErr w:type="gramEnd"/>
-      <w:r>
-        <w:t xml:space="preserve"> Spring to call another REST API (another </w:t>
+        <w:t xml:space="preserve"> -&gt; Is used In Spring to call another REST API (another </w:t>
       </w:r>
       <w:proofErr w:type="spellStart"/>
       <w:r>
@@ -3409,7 +3397,6 @@
         <w:t xml:space="preserve"> </w:t>
       </w:r>
       <w:proofErr w:type="spellStart"/>
-      <w:proofErr w:type="gramStart"/>
       <w:r>
         <w:rPr>
           <w:rFonts w:ascii="Consolas" w:hAnsi="Consolas"/>
@@ -3438,7 +3425,6 @@
         </w:rPr>
         <w:t>id</w:t>
       </w:r>
-      <w:proofErr w:type="gramEnd"/>
       <w:r>
         <w:rPr>
           <w:rFonts w:ascii="Consolas" w:hAnsi="Consolas"/>
@@ -3516,7 +3502,6 @@
         <w:t>=</w:t>
       </w:r>
       <w:proofErr w:type="spellStart"/>
-      <w:proofErr w:type="gramStart"/>
       <w:r>
         <w:rPr>
           <w:rFonts w:ascii="Consolas" w:hAnsi="Consolas"/>
@@ -3545,7 +3530,6 @@
         <w:t>getForObject</w:t>
       </w:r>
       <w:proofErr w:type="spellEnd"/>
-      <w:proofErr w:type="gramEnd"/>
       <w:r>
         <w:rPr>
           <w:rFonts w:ascii="Consolas" w:hAnsi="Consolas"/>
@@ -3697,7 +3681,6 @@
         <w:t>=</w:t>
       </w:r>
       <w:proofErr w:type="spellStart"/>
-      <w:proofErr w:type="gramStart"/>
       <w:r>
         <w:rPr>
           <w:rFonts w:ascii="Consolas" w:hAnsi="Consolas"/>
@@ -3726,7 +3709,6 @@
         <w:t>getForObject</w:t>
       </w:r>
       <w:proofErr w:type="spellEnd"/>
-      <w:proofErr w:type="gramEnd"/>
       <w:r>
         <w:rPr>
           <w:rFonts w:ascii="Consolas" w:hAnsi="Consolas"/>
@@ -4569,18 +4551,10 @@
       </w:r>
       <w:proofErr w:type="spellEnd"/>
       <w:r>
-        <w:t xml:space="preserve"> -&gt; This enables feign clients in the application, it tells spring boot to scan the </w:t>
-      </w:r>
-      <w:proofErr w:type="gramStart"/>
-      <w:r>
-        <w:t xml:space="preserve">package, </w:t>
-      </w:r>
-      <w:r>
-        <w:t xml:space="preserve"> and</w:t>
-      </w:r>
-      <w:proofErr w:type="gramEnd"/>
-      <w:r>
-        <w:t xml:space="preserve"> create implementations for all feign interfaces</w:t>
+        <w:t xml:space="preserve"> -&gt; This enables feign clients in the application, it tells spring boot to scan the package, </w:t>
+      </w:r>
+      <w:r>
+        <w:t xml:space="preserve"> and create implementations for all feign interfaces</w:t>
       </w:r>
     </w:p>
     <w:p>
@@ -4714,15 +4688,7 @@
       </w:r>
       <w:proofErr w:type="spellEnd"/>
       <w:r>
-        <w:t xml:space="preserve"> offers reactive capabilities, </w:t>
-      </w:r>
-      <w:proofErr w:type="gramStart"/>
-      <w:r>
-        <w:t>Feign</w:t>
-      </w:r>
-      <w:proofErr w:type="gramEnd"/>
-      <w:r>
-        <w:t xml:space="preserve"> provides a more declarative and developer friendly approach to making </w:t>
+        <w:t xml:space="preserve"> offers reactive capabilities, Feign provides a more declarative and developer friendly approach to making </w:t>
       </w:r>
       <w:proofErr w:type="spellStart"/>
       <w:r>
@@ -4832,7 +4798,6 @@
         <w:t xml:space="preserve">In </w:t>
       </w:r>
       <w:proofErr w:type="spellStart"/>
-      <w:proofErr w:type="gramStart"/>
       <w:r>
         <w:rPr>
           <w:b/>
@@ -4846,7 +4811,6 @@
         </w:rPr>
         <w:t xml:space="preserve"> :</w:t>
       </w:r>
-      <w:proofErr w:type="gramEnd"/>
       <w:r>
         <w:t xml:space="preserve"> </w:t>
       </w:r>
@@ -5270,15 +5234,7 @@
         <w:t xml:space="preserve"> using eureka:</w:t>
       </w:r>
       <w:r>
-        <w:t xml:space="preserve"> Client -&gt; API </w:t>
-      </w:r>
-      <w:proofErr w:type="gramStart"/>
-      <w:r>
-        <w:t>Gateway(</w:t>
-      </w:r>
-      <w:proofErr w:type="gramEnd"/>
-      <w:r>
-        <w:t xml:space="preserve">Port 8989) -&gt; Check route path = /employee/** -&gt; </w:t>
+        <w:t xml:space="preserve"> Client -&gt; API Gateway(Port 8989) -&gt; Check route path = /employee/** -&gt; </w:t>
       </w:r>
       <w:proofErr w:type="spellStart"/>
       <w:r>
@@ -5288,6 +5244,2439 @@
       <w:r>
         <w:t xml:space="preserve"> = lb://EMPLOYEE-SERVICE -&gt; Gateway uses Eureka -&gt; Eureka returns service instance  -&gt; request forwarded</w:t>
       </w:r>
+    </w:p>
+    <w:p/>
+    <w:p/>
+    <w:p>
+      <w:pPr>
+        <w:spacing w:before="100" w:beforeAutospacing="1" w:after="100" w:afterAutospacing="1" w:line="240" w:lineRule="auto"/>
+        <w:rPr>
+          <w:rFonts w:ascii="Times New Roman" w:eastAsia="Times New Roman" w:hAnsi="Times New Roman" w:cs="Times New Roman"/>
+          <w:sz w:val="24"/>
+          <w:szCs w:val="24"/>
+        </w:rPr>
+      </w:pPr>
+      <w:r>
+        <w:rPr>
+          <w:rFonts w:ascii="Times New Roman" w:eastAsia="Times New Roman" w:hAnsi="Times New Roman" w:cs="Times New Roman"/>
+          <w:b/>
+          <w:bCs/>
+          <w:sz w:val="24"/>
+          <w:szCs w:val="24"/>
+        </w:rPr>
+        <w:t>Spring Boot Actuator</w:t>
+      </w:r>
+      <w:r>
+        <w:rPr>
+          <w:rFonts w:ascii="Times New Roman" w:eastAsia="Times New Roman" w:hAnsi="Times New Roman" w:cs="Times New Roman"/>
+          <w:b/>
+          <w:bCs/>
+          <w:sz w:val="24"/>
+          <w:szCs w:val="24"/>
+        </w:rPr>
+        <w:t>-&gt;</w:t>
+      </w:r>
+      <w:r>
+        <w:rPr>
+          <w:rFonts w:ascii="Times New Roman" w:eastAsia="Times New Roman" w:hAnsi="Times New Roman" w:cs="Times New Roman"/>
+          <w:sz w:val="24"/>
+          <w:szCs w:val="24"/>
+        </w:rPr>
+        <w:t xml:space="preserve"> is a module that provides </w:t>
+      </w:r>
+      <w:r>
+        <w:rPr>
+          <w:rFonts w:ascii="Times New Roman" w:eastAsia="Times New Roman" w:hAnsi="Times New Roman" w:cs="Times New Roman"/>
+          <w:b/>
+          <w:bCs/>
+          <w:sz w:val="24"/>
+          <w:szCs w:val="24"/>
+        </w:rPr>
+        <w:t>production-ready monitoring and management features</w:t>
+      </w:r>
+      <w:r>
+        <w:rPr>
+          <w:rFonts w:ascii="Times New Roman" w:eastAsia="Times New Roman" w:hAnsi="Times New Roman" w:cs="Times New Roman"/>
+          <w:sz w:val="24"/>
+          <w:szCs w:val="24"/>
+        </w:rPr>
+        <w:t xml:space="preserve"> for a Spring Boot application. It exposes </w:t>
+      </w:r>
+      <w:r>
+        <w:rPr>
+          <w:rFonts w:ascii="Times New Roman" w:eastAsia="Times New Roman" w:hAnsi="Times New Roman" w:cs="Times New Roman"/>
+          <w:b/>
+          <w:bCs/>
+          <w:sz w:val="24"/>
+          <w:szCs w:val="24"/>
+        </w:rPr>
+        <w:t>built-in endpoints</w:t>
+      </w:r>
+      <w:r>
+        <w:rPr>
+          <w:rFonts w:ascii="Times New Roman" w:eastAsia="Times New Roman" w:hAnsi="Times New Roman" w:cs="Times New Roman"/>
+          <w:sz w:val="24"/>
+          <w:szCs w:val="24"/>
+        </w:rPr>
+        <w:t xml:space="preserve"> that let you check the </w:t>
+      </w:r>
+      <w:r>
+        <w:rPr>
+          <w:rFonts w:ascii="Times New Roman" w:eastAsia="Times New Roman" w:hAnsi="Times New Roman" w:cs="Times New Roman"/>
+          <w:b/>
+          <w:bCs/>
+          <w:sz w:val="24"/>
+          <w:szCs w:val="24"/>
+        </w:rPr>
+        <w:t>health, metrics, environment, beans, mappings, logs, and application status</w:t>
+      </w:r>
+      <w:r>
+        <w:rPr>
+          <w:rFonts w:ascii="Times New Roman" w:eastAsia="Times New Roman" w:hAnsi="Times New Roman" w:cs="Times New Roman"/>
+          <w:sz w:val="24"/>
+          <w:szCs w:val="24"/>
+        </w:rPr>
+        <w:t xml:space="preserve"> of your service.</w:t>
+      </w:r>
+    </w:p>
+    <w:p>
+      <w:pPr>
+        <w:spacing w:before="100" w:beforeAutospacing="1" w:after="100" w:afterAutospacing="1" w:line="240" w:lineRule="auto"/>
+        <w:rPr>
+          <w:rFonts w:ascii="Times New Roman" w:eastAsia="Times New Roman" w:hAnsi="Times New Roman" w:cs="Times New Roman"/>
+          <w:sz w:val="24"/>
+          <w:szCs w:val="24"/>
+        </w:rPr>
+      </w:pPr>
+      <w:r>
+        <w:rPr>
+          <w:rFonts w:ascii="Times New Roman" w:eastAsia="Times New Roman" w:hAnsi="Times New Roman" w:cs="Times New Roman"/>
+          <w:sz w:val="24"/>
+          <w:szCs w:val="24"/>
+        </w:rPr>
+        <w:t xml:space="preserve">In </w:t>
+      </w:r>
+      <w:proofErr w:type="spellStart"/>
+      <w:r>
+        <w:rPr>
+          <w:rFonts w:ascii="Times New Roman" w:eastAsia="Times New Roman" w:hAnsi="Times New Roman" w:cs="Times New Roman"/>
+          <w:sz w:val="24"/>
+          <w:szCs w:val="24"/>
+        </w:rPr>
+        <w:t>microservices</w:t>
+      </w:r>
+      <w:proofErr w:type="spellEnd"/>
+      <w:r>
+        <w:rPr>
+          <w:rFonts w:ascii="Times New Roman" w:eastAsia="Times New Roman" w:hAnsi="Times New Roman" w:cs="Times New Roman"/>
+          <w:sz w:val="24"/>
+          <w:szCs w:val="24"/>
+        </w:rPr>
+        <w:t xml:space="preserve"> architectures (like the one you’re building with Eureka, Gateway, and Feign), Actuator is commonly used to </w:t>
+      </w:r>
+      <w:r>
+        <w:rPr>
+          <w:rFonts w:ascii="Times New Roman" w:eastAsia="Times New Roman" w:hAnsi="Times New Roman" w:cs="Times New Roman"/>
+          <w:b/>
+          <w:bCs/>
+          <w:sz w:val="24"/>
+          <w:szCs w:val="24"/>
+        </w:rPr>
+        <w:t>monitor services and help service discovery tools determine whether an instance is healthy</w:t>
+      </w:r>
+      <w:r>
+        <w:rPr>
+          <w:rFonts w:ascii="Times New Roman" w:eastAsia="Times New Roman" w:hAnsi="Times New Roman" w:cs="Times New Roman"/>
+          <w:sz w:val="24"/>
+          <w:szCs w:val="24"/>
+        </w:rPr>
+        <w:t>.</w:t>
+      </w:r>
+    </w:p>
+    <w:p>
+      <w:pPr>
+        <w:spacing w:before="100" w:beforeAutospacing="1" w:after="100" w:afterAutospacing="1" w:line="240" w:lineRule="auto"/>
+        <w:rPr>
+          <w:rFonts w:ascii="Times New Roman" w:eastAsia="Times New Roman" w:hAnsi="Times New Roman" w:cs="Times New Roman"/>
+          <w:sz w:val="24"/>
+          <w:szCs w:val="24"/>
+        </w:rPr>
+      </w:pPr>
+      <w:r>
+        <w:rPr>
+          <w:rFonts w:ascii="Times New Roman" w:eastAsia="Times New Roman" w:hAnsi="Times New Roman" w:cs="Times New Roman"/>
+          <w:sz w:val="24"/>
+          <w:szCs w:val="24"/>
+        </w:rPr>
+        <w:t>Typical endpoints include:</w:t>
+      </w:r>
+    </w:p>
+    <w:tbl>
+      <w:tblPr>
+        <w:tblW w:w="0" w:type="auto"/>
+        <w:tblCellSpacing w:w="15" w:type="dxa"/>
+        <w:tblCellMar>
+          <w:top w:w="15" w:type="dxa"/>
+          <w:left w:w="15" w:type="dxa"/>
+          <w:bottom w:w="15" w:type="dxa"/>
+          <w:right w:w="15" w:type="dxa"/>
+        </w:tblCellMar>
+        <w:tblLook w:val="04A0" w:firstRow="1" w:lastRow="0" w:firstColumn="1" w:lastColumn="0" w:noHBand="0" w:noVBand="1"/>
+      </w:tblPr>
+      <w:tblGrid>
+        <w:gridCol w:w="2476"/>
+        <w:gridCol w:w="2488"/>
+      </w:tblGrid>
+      <w:tr>
+        <w:trPr>
+          <w:tblHeader/>
+          <w:tblCellSpacing w:w="15" w:type="dxa"/>
+        </w:trPr>
+        <w:tc>
+          <w:tcPr>
+            <w:tcW w:w="0" w:type="auto"/>
+            <w:vAlign w:val="center"/>
+            <w:hideMark/>
+          </w:tcPr>
+          <w:p>
+            <w:pPr>
+              <w:spacing w:after="0" w:line="240" w:lineRule="auto"/>
+              <w:jc w:val="center"/>
+              <w:rPr>
+                <w:rFonts w:ascii="Times New Roman" w:eastAsia="Times New Roman" w:hAnsi="Times New Roman" w:cs="Times New Roman"/>
+                <w:b/>
+                <w:bCs/>
+                <w:sz w:val="24"/>
+                <w:szCs w:val="24"/>
+              </w:rPr>
+            </w:pPr>
+            <w:r>
+              <w:rPr>
+                <w:rFonts w:ascii="Times New Roman" w:eastAsia="Times New Roman" w:hAnsi="Times New Roman" w:cs="Times New Roman"/>
+                <w:b/>
+                <w:bCs/>
+                <w:sz w:val="24"/>
+                <w:szCs w:val="24"/>
+              </w:rPr>
+              <w:t>Endpoint</w:t>
+            </w:r>
+          </w:p>
+        </w:tc>
+        <w:tc>
+          <w:tcPr>
+            <w:tcW w:w="0" w:type="auto"/>
+            <w:vAlign w:val="center"/>
+            <w:hideMark/>
+          </w:tcPr>
+          <w:p>
+            <w:pPr>
+              <w:spacing w:after="0" w:line="240" w:lineRule="auto"/>
+              <w:jc w:val="center"/>
+              <w:rPr>
+                <w:rFonts w:ascii="Times New Roman" w:eastAsia="Times New Roman" w:hAnsi="Times New Roman" w:cs="Times New Roman"/>
+                <w:b/>
+                <w:bCs/>
+                <w:sz w:val="24"/>
+                <w:szCs w:val="24"/>
+              </w:rPr>
+            </w:pPr>
+            <w:r>
+              <w:rPr>
+                <w:rFonts w:ascii="Times New Roman" w:eastAsia="Times New Roman" w:hAnsi="Times New Roman" w:cs="Times New Roman"/>
+                <w:b/>
+                <w:bCs/>
+                <w:sz w:val="24"/>
+                <w:szCs w:val="24"/>
+              </w:rPr>
+              <w:t>Purpose</w:t>
+            </w:r>
+          </w:p>
+        </w:tc>
+      </w:tr>
+      <w:tr>
+        <w:trPr>
+          <w:tblCellSpacing w:w="15" w:type="dxa"/>
+        </w:trPr>
+        <w:tc>
+          <w:tcPr>
+            <w:tcW w:w="0" w:type="auto"/>
+            <w:vAlign w:val="center"/>
+            <w:hideMark/>
+          </w:tcPr>
+          <w:p>
+            <w:pPr>
+              <w:spacing w:after="0" w:line="240" w:lineRule="auto"/>
+              <w:rPr>
+                <w:rFonts w:ascii="Times New Roman" w:eastAsia="Times New Roman" w:hAnsi="Times New Roman" w:cs="Times New Roman"/>
+                <w:sz w:val="24"/>
+                <w:szCs w:val="24"/>
+              </w:rPr>
+            </w:pPr>
+            <w:r>
+              <w:rPr>
+                <w:rFonts w:ascii="Courier New" w:eastAsia="Times New Roman" w:hAnsi="Courier New" w:cs="Courier New"/>
+                <w:sz w:val="20"/>
+                <w:szCs w:val="20"/>
+              </w:rPr>
+              <w:t>/actuator/health</w:t>
+            </w:r>
+          </w:p>
+        </w:tc>
+        <w:tc>
+          <w:tcPr>
+            <w:tcW w:w="0" w:type="auto"/>
+            <w:vAlign w:val="center"/>
+            <w:hideMark/>
+          </w:tcPr>
+          <w:p>
+            <w:pPr>
+              <w:spacing w:after="0" w:line="240" w:lineRule="auto"/>
+              <w:rPr>
+                <w:rFonts w:ascii="Times New Roman" w:eastAsia="Times New Roman" w:hAnsi="Times New Roman" w:cs="Times New Roman"/>
+                <w:sz w:val="24"/>
+                <w:szCs w:val="24"/>
+              </w:rPr>
+            </w:pPr>
+            <w:r>
+              <w:rPr>
+                <w:rFonts w:ascii="Times New Roman" w:eastAsia="Times New Roman" w:hAnsi="Times New Roman" w:cs="Times New Roman"/>
+                <w:sz w:val="24"/>
+                <w:szCs w:val="24"/>
+              </w:rPr>
+              <w:t>Shows application health</w:t>
+            </w:r>
+          </w:p>
+        </w:tc>
+      </w:tr>
+      <w:tr>
+        <w:trPr>
+          <w:tblCellSpacing w:w="15" w:type="dxa"/>
+        </w:trPr>
+        <w:tc>
+          <w:tcPr>
+            <w:tcW w:w="0" w:type="auto"/>
+            <w:vAlign w:val="center"/>
+            <w:hideMark/>
+          </w:tcPr>
+          <w:p>
+            <w:pPr>
+              <w:spacing w:after="0" w:line="240" w:lineRule="auto"/>
+              <w:rPr>
+                <w:rFonts w:ascii="Times New Roman" w:eastAsia="Times New Roman" w:hAnsi="Times New Roman" w:cs="Times New Roman"/>
+                <w:sz w:val="24"/>
+                <w:szCs w:val="24"/>
+              </w:rPr>
+            </w:pPr>
+            <w:r>
+              <w:rPr>
+                <w:rFonts w:ascii="Courier New" w:eastAsia="Times New Roman" w:hAnsi="Courier New" w:cs="Courier New"/>
+                <w:sz w:val="20"/>
+                <w:szCs w:val="20"/>
+              </w:rPr>
+              <w:t>/actuator/info</w:t>
+            </w:r>
+          </w:p>
+        </w:tc>
+        <w:tc>
+          <w:tcPr>
+            <w:tcW w:w="0" w:type="auto"/>
+            <w:vAlign w:val="center"/>
+            <w:hideMark/>
+          </w:tcPr>
+          <w:p>
+            <w:pPr>
+              <w:spacing w:after="0" w:line="240" w:lineRule="auto"/>
+              <w:rPr>
+                <w:rFonts w:ascii="Times New Roman" w:eastAsia="Times New Roman" w:hAnsi="Times New Roman" w:cs="Times New Roman"/>
+                <w:sz w:val="24"/>
+                <w:szCs w:val="24"/>
+              </w:rPr>
+            </w:pPr>
+            <w:r>
+              <w:rPr>
+                <w:rFonts w:ascii="Times New Roman" w:eastAsia="Times New Roman" w:hAnsi="Times New Roman" w:cs="Times New Roman"/>
+                <w:sz w:val="24"/>
+                <w:szCs w:val="24"/>
+              </w:rPr>
+              <w:t>Application information</w:t>
+            </w:r>
+          </w:p>
+        </w:tc>
+      </w:tr>
+      <w:tr>
+        <w:trPr>
+          <w:tblCellSpacing w:w="15" w:type="dxa"/>
+        </w:trPr>
+        <w:tc>
+          <w:tcPr>
+            <w:tcW w:w="0" w:type="auto"/>
+            <w:vAlign w:val="center"/>
+            <w:hideMark/>
+          </w:tcPr>
+          <w:p>
+            <w:pPr>
+              <w:spacing w:after="0" w:line="240" w:lineRule="auto"/>
+              <w:rPr>
+                <w:rFonts w:ascii="Times New Roman" w:eastAsia="Times New Roman" w:hAnsi="Times New Roman" w:cs="Times New Roman"/>
+                <w:sz w:val="24"/>
+                <w:szCs w:val="24"/>
+              </w:rPr>
+            </w:pPr>
+            <w:r>
+              <w:rPr>
+                <w:rFonts w:ascii="Courier New" w:eastAsia="Times New Roman" w:hAnsi="Courier New" w:cs="Courier New"/>
+                <w:sz w:val="20"/>
+                <w:szCs w:val="20"/>
+              </w:rPr>
+              <w:t>/actuator/metrics</w:t>
+            </w:r>
+          </w:p>
+        </w:tc>
+        <w:tc>
+          <w:tcPr>
+            <w:tcW w:w="0" w:type="auto"/>
+            <w:vAlign w:val="center"/>
+            <w:hideMark/>
+          </w:tcPr>
+          <w:p>
+            <w:pPr>
+              <w:spacing w:after="0" w:line="240" w:lineRule="auto"/>
+              <w:rPr>
+                <w:rFonts w:ascii="Times New Roman" w:eastAsia="Times New Roman" w:hAnsi="Times New Roman" w:cs="Times New Roman"/>
+                <w:sz w:val="24"/>
+                <w:szCs w:val="24"/>
+              </w:rPr>
+            </w:pPr>
+            <w:r>
+              <w:rPr>
+                <w:rFonts w:ascii="Times New Roman" w:eastAsia="Times New Roman" w:hAnsi="Times New Roman" w:cs="Times New Roman"/>
+                <w:sz w:val="24"/>
+                <w:szCs w:val="24"/>
+              </w:rPr>
+              <w:t>JVM and app metrics</w:t>
+            </w:r>
+          </w:p>
+        </w:tc>
+      </w:tr>
+      <w:tr>
+        <w:trPr>
+          <w:tblCellSpacing w:w="15" w:type="dxa"/>
+        </w:trPr>
+        <w:tc>
+          <w:tcPr>
+            <w:tcW w:w="0" w:type="auto"/>
+            <w:vAlign w:val="center"/>
+            <w:hideMark/>
+          </w:tcPr>
+          <w:p>
+            <w:pPr>
+              <w:spacing w:after="0" w:line="240" w:lineRule="auto"/>
+              <w:rPr>
+                <w:rFonts w:ascii="Times New Roman" w:eastAsia="Times New Roman" w:hAnsi="Times New Roman" w:cs="Times New Roman"/>
+                <w:sz w:val="24"/>
+                <w:szCs w:val="24"/>
+              </w:rPr>
+            </w:pPr>
+            <w:r>
+              <w:rPr>
+                <w:rFonts w:ascii="Courier New" w:eastAsia="Times New Roman" w:hAnsi="Courier New" w:cs="Courier New"/>
+                <w:sz w:val="20"/>
+                <w:szCs w:val="20"/>
+              </w:rPr>
+              <w:t>/actuator/</w:t>
+            </w:r>
+            <w:proofErr w:type="spellStart"/>
+            <w:r>
+              <w:rPr>
+                <w:rFonts w:ascii="Courier New" w:eastAsia="Times New Roman" w:hAnsi="Courier New" w:cs="Courier New"/>
+                <w:sz w:val="20"/>
+                <w:szCs w:val="20"/>
+              </w:rPr>
+              <w:t>env</w:t>
+            </w:r>
+            <w:proofErr w:type="spellEnd"/>
+          </w:p>
+        </w:tc>
+        <w:tc>
+          <w:tcPr>
+            <w:tcW w:w="0" w:type="auto"/>
+            <w:vAlign w:val="center"/>
+            <w:hideMark/>
+          </w:tcPr>
+          <w:p>
+            <w:pPr>
+              <w:spacing w:after="0" w:line="240" w:lineRule="auto"/>
+              <w:rPr>
+                <w:rFonts w:ascii="Times New Roman" w:eastAsia="Times New Roman" w:hAnsi="Times New Roman" w:cs="Times New Roman"/>
+                <w:sz w:val="24"/>
+                <w:szCs w:val="24"/>
+              </w:rPr>
+            </w:pPr>
+            <w:r>
+              <w:rPr>
+                <w:rFonts w:ascii="Times New Roman" w:eastAsia="Times New Roman" w:hAnsi="Times New Roman" w:cs="Times New Roman"/>
+                <w:sz w:val="24"/>
+                <w:szCs w:val="24"/>
+              </w:rPr>
+              <w:t>Environment variables</w:t>
+            </w:r>
+          </w:p>
+        </w:tc>
+      </w:tr>
+      <w:tr>
+        <w:trPr>
+          <w:tblCellSpacing w:w="15" w:type="dxa"/>
+        </w:trPr>
+        <w:tc>
+          <w:tcPr>
+            <w:tcW w:w="0" w:type="auto"/>
+            <w:vAlign w:val="center"/>
+            <w:hideMark/>
+          </w:tcPr>
+          <w:p>
+            <w:pPr>
+              <w:spacing w:after="0" w:line="240" w:lineRule="auto"/>
+              <w:rPr>
+                <w:rFonts w:ascii="Times New Roman" w:eastAsia="Times New Roman" w:hAnsi="Times New Roman" w:cs="Times New Roman"/>
+                <w:sz w:val="24"/>
+                <w:szCs w:val="24"/>
+              </w:rPr>
+            </w:pPr>
+            <w:r>
+              <w:rPr>
+                <w:rFonts w:ascii="Courier New" w:eastAsia="Times New Roman" w:hAnsi="Courier New" w:cs="Courier New"/>
+                <w:sz w:val="20"/>
+                <w:szCs w:val="20"/>
+              </w:rPr>
+              <w:t>/actuator/beans</w:t>
+            </w:r>
+          </w:p>
+        </w:tc>
+        <w:tc>
+          <w:tcPr>
+            <w:tcW w:w="0" w:type="auto"/>
+            <w:vAlign w:val="center"/>
+            <w:hideMark/>
+          </w:tcPr>
+          <w:p>
+            <w:pPr>
+              <w:spacing w:after="0" w:line="240" w:lineRule="auto"/>
+              <w:rPr>
+                <w:rFonts w:ascii="Times New Roman" w:eastAsia="Times New Roman" w:hAnsi="Times New Roman" w:cs="Times New Roman"/>
+                <w:sz w:val="24"/>
+                <w:szCs w:val="24"/>
+              </w:rPr>
+            </w:pPr>
+            <w:r>
+              <w:rPr>
+                <w:rFonts w:ascii="Times New Roman" w:eastAsia="Times New Roman" w:hAnsi="Times New Roman" w:cs="Times New Roman"/>
+                <w:sz w:val="24"/>
+                <w:szCs w:val="24"/>
+              </w:rPr>
+              <w:t>All Spring beans</w:t>
+            </w:r>
+          </w:p>
+        </w:tc>
+      </w:tr>
+      <w:tr>
+        <w:trPr>
+          <w:tblCellSpacing w:w="15" w:type="dxa"/>
+        </w:trPr>
+        <w:tc>
+          <w:tcPr>
+            <w:tcW w:w="0" w:type="auto"/>
+            <w:vAlign w:val="center"/>
+            <w:hideMark/>
+          </w:tcPr>
+          <w:p>
+            <w:pPr>
+              <w:spacing w:after="0" w:line="240" w:lineRule="auto"/>
+              <w:rPr>
+                <w:rFonts w:ascii="Times New Roman" w:eastAsia="Times New Roman" w:hAnsi="Times New Roman" w:cs="Times New Roman"/>
+                <w:sz w:val="24"/>
+                <w:szCs w:val="24"/>
+              </w:rPr>
+            </w:pPr>
+            <w:r>
+              <w:rPr>
+                <w:rFonts w:ascii="Courier New" w:eastAsia="Times New Roman" w:hAnsi="Courier New" w:cs="Courier New"/>
+                <w:sz w:val="20"/>
+                <w:szCs w:val="20"/>
+              </w:rPr>
+              <w:t>/actuator/mappings</w:t>
+            </w:r>
+          </w:p>
+        </w:tc>
+        <w:tc>
+          <w:tcPr>
+            <w:tcW w:w="0" w:type="auto"/>
+            <w:vAlign w:val="center"/>
+            <w:hideMark/>
+          </w:tcPr>
+          <w:p>
+            <w:pPr>
+              <w:spacing w:after="0" w:line="240" w:lineRule="auto"/>
+              <w:rPr>
+                <w:rFonts w:ascii="Times New Roman" w:eastAsia="Times New Roman" w:hAnsi="Times New Roman" w:cs="Times New Roman"/>
+                <w:sz w:val="24"/>
+                <w:szCs w:val="24"/>
+              </w:rPr>
+            </w:pPr>
+            <w:r>
+              <w:rPr>
+                <w:rFonts w:ascii="Times New Roman" w:eastAsia="Times New Roman" w:hAnsi="Times New Roman" w:cs="Times New Roman"/>
+                <w:sz w:val="24"/>
+                <w:szCs w:val="24"/>
+              </w:rPr>
+              <w:t>All request mappings</w:t>
+            </w:r>
+          </w:p>
+        </w:tc>
+      </w:tr>
+      <w:tr>
+        <w:trPr>
+          <w:tblCellSpacing w:w="15" w:type="dxa"/>
+        </w:trPr>
+        <w:tc>
+          <w:tcPr>
+            <w:tcW w:w="0" w:type="auto"/>
+            <w:vAlign w:val="center"/>
+            <w:hideMark/>
+          </w:tcPr>
+          <w:p>
+            <w:pPr>
+              <w:spacing w:after="0" w:line="240" w:lineRule="auto"/>
+              <w:rPr>
+                <w:rFonts w:ascii="Times New Roman" w:eastAsia="Times New Roman" w:hAnsi="Times New Roman" w:cs="Times New Roman"/>
+                <w:sz w:val="24"/>
+                <w:szCs w:val="24"/>
+              </w:rPr>
+            </w:pPr>
+            <w:r>
+              <w:rPr>
+                <w:rFonts w:ascii="Courier New" w:eastAsia="Times New Roman" w:hAnsi="Courier New" w:cs="Courier New"/>
+                <w:sz w:val="20"/>
+                <w:szCs w:val="20"/>
+              </w:rPr>
+              <w:t>/actuator/loggers</w:t>
+            </w:r>
+          </w:p>
+        </w:tc>
+        <w:tc>
+          <w:tcPr>
+            <w:tcW w:w="0" w:type="auto"/>
+            <w:vAlign w:val="center"/>
+            <w:hideMark/>
+          </w:tcPr>
+          <w:p>
+            <w:pPr>
+              <w:spacing w:after="0" w:line="240" w:lineRule="auto"/>
+              <w:rPr>
+                <w:rFonts w:ascii="Times New Roman" w:eastAsia="Times New Roman" w:hAnsi="Times New Roman" w:cs="Times New Roman"/>
+                <w:sz w:val="24"/>
+                <w:szCs w:val="24"/>
+              </w:rPr>
+            </w:pPr>
+            <w:r>
+              <w:rPr>
+                <w:rFonts w:ascii="Times New Roman" w:eastAsia="Times New Roman" w:hAnsi="Times New Roman" w:cs="Times New Roman"/>
+                <w:sz w:val="24"/>
+                <w:szCs w:val="24"/>
+              </w:rPr>
+              <w:t>Logging levels</w:t>
+            </w:r>
+          </w:p>
+        </w:tc>
+      </w:tr>
+      <w:tr>
+        <w:trPr>
+          <w:tblCellSpacing w:w="15" w:type="dxa"/>
+        </w:trPr>
+        <w:tc>
+          <w:tcPr>
+            <w:tcW w:w="0" w:type="auto"/>
+            <w:vAlign w:val="center"/>
+            <w:hideMark/>
+          </w:tcPr>
+          <w:p>
+            <w:pPr>
+              <w:spacing w:after="0" w:line="240" w:lineRule="auto"/>
+              <w:rPr>
+                <w:rFonts w:ascii="Times New Roman" w:eastAsia="Times New Roman" w:hAnsi="Times New Roman" w:cs="Times New Roman"/>
+                <w:sz w:val="24"/>
+                <w:szCs w:val="24"/>
+              </w:rPr>
+            </w:pPr>
+            <w:r>
+              <w:rPr>
+                <w:rFonts w:ascii="Courier New" w:eastAsia="Times New Roman" w:hAnsi="Courier New" w:cs="Courier New"/>
+                <w:sz w:val="20"/>
+                <w:szCs w:val="20"/>
+              </w:rPr>
+              <w:t>/actuator/</w:t>
+            </w:r>
+            <w:proofErr w:type="spellStart"/>
+            <w:r>
+              <w:rPr>
+                <w:rFonts w:ascii="Courier New" w:eastAsia="Times New Roman" w:hAnsi="Courier New" w:cs="Courier New"/>
+                <w:sz w:val="20"/>
+                <w:szCs w:val="20"/>
+              </w:rPr>
+              <w:t>threaddump</w:t>
+            </w:r>
+            <w:proofErr w:type="spellEnd"/>
+          </w:p>
+        </w:tc>
+        <w:tc>
+          <w:tcPr>
+            <w:tcW w:w="0" w:type="auto"/>
+            <w:vAlign w:val="center"/>
+            <w:hideMark/>
+          </w:tcPr>
+          <w:p>
+            <w:pPr>
+              <w:spacing w:after="0" w:line="240" w:lineRule="auto"/>
+              <w:rPr>
+                <w:rFonts w:ascii="Times New Roman" w:eastAsia="Times New Roman" w:hAnsi="Times New Roman" w:cs="Times New Roman"/>
+                <w:sz w:val="24"/>
+                <w:szCs w:val="24"/>
+              </w:rPr>
+            </w:pPr>
+            <w:r>
+              <w:rPr>
+                <w:rFonts w:ascii="Times New Roman" w:eastAsia="Times New Roman" w:hAnsi="Times New Roman" w:cs="Times New Roman"/>
+                <w:sz w:val="24"/>
+                <w:szCs w:val="24"/>
+              </w:rPr>
+              <w:t>Thread information</w:t>
+            </w:r>
+          </w:p>
+        </w:tc>
+      </w:tr>
+    </w:tbl>
+    <w:p>
+      <w:pPr>
+        <w:pStyle w:val="NormalWeb"/>
+      </w:pPr>
+      <w:r>
+        <w:rPr>
+          <w:rStyle w:val="Strong"/>
+        </w:rPr>
+        <w:lastRenderedPageBreak/>
+        <w:t>Resilience4j</w:t>
+      </w:r>
+      <w:r>
+        <w:t xml:space="preserve"> is a lightweight </w:t>
+      </w:r>
+      <w:r>
+        <w:rPr>
+          <w:rStyle w:val="Strong"/>
+        </w:rPr>
+        <w:t xml:space="preserve">fault-tolerance library for Java </w:t>
+      </w:r>
+      <w:proofErr w:type="spellStart"/>
+      <w:r>
+        <w:rPr>
+          <w:rStyle w:val="Strong"/>
+        </w:rPr>
+        <w:t>microservices</w:t>
+      </w:r>
+      <w:proofErr w:type="spellEnd"/>
+      <w:r>
+        <w:t xml:space="preserve">. It helps your application </w:t>
+      </w:r>
+      <w:r>
+        <w:rPr>
+          <w:rStyle w:val="Strong"/>
+        </w:rPr>
+        <w:t>handle failures gracefully</w:t>
+      </w:r>
+      <w:r>
+        <w:t xml:space="preserve"> when calling other services (like Feign clients in your </w:t>
+      </w:r>
+      <w:proofErr w:type="spellStart"/>
+      <w:r>
+        <w:t>microservices</w:t>
+      </w:r>
+      <w:proofErr w:type="spellEnd"/>
+      <w:r>
+        <w:t xml:space="preserve"> architecture).</w:t>
+      </w:r>
+    </w:p>
+    <w:p>
+      <w:pPr>
+        <w:pStyle w:val="NormalWeb"/>
+      </w:pPr>
+      <w:r>
+        <w:t xml:space="preserve">In </w:t>
+      </w:r>
+      <w:proofErr w:type="spellStart"/>
+      <w:r>
+        <w:t>microservices</w:t>
+      </w:r>
+      <w:proofErr w:type="spellEnd"/>
+      <w:r>
+        <w:t>, services may fail due to:</w:t>
+      </w:r>
+    </w:p>
+    <w:p>
+      <w:pPr>
+        <w:pStyle w:val="NormalWeb"/>
+        <w:numPr>
+          <w:ilvl w:val="0"/>
+          <w:numId w:val="2"/>
+        </w:numPr>
+      </w:pPr>
+      <w:r>
+        <w:t>network issues</w:t>
+      </w:r>
+    </w:p>
+    <w:p>
+      <w:pPr>
+        <w:pStyle w:val="NormalWeb"/>
+        <w:numPr>
+          <w:ilvl w:val="0"/>
+          <w:numId w:val="2"/>
+        </w:numPr>
+      </w:pPr>
+      <w:r>
+        <w:t>slow response</w:t>
+      </w:r>
+    </w:p>
+    <w:p>
+      <w:pPr>
+        <w:pStyle w:val="NormalWeb"/>
+        <w:numPr>
+          <w:ilvl w:val="0"/>
+          <w:numId w:val="2"/>
+        </w:numPr>
+      </w:pPr>
+      <w:r>
+        <w:t>service down</w:t>
+      </w:r>
+    </w:p>
+    <w:p>
+      <w:pPr>
+        <w:pStyle w:val="NormalWeb"/>
+        <w:numPr>
+          <w:ilvl w:val="0"/>
+          <w:numId w:val="2"/>
+        </w:numPr>
+      </w:pPr>
+      <w:r>
+        <w:t>high load</w:t>
+      </w:r>
+    </w:p>
+    <w:p>
+      <w:pPr>
+        <w:pStyle w:val="NormalWeb"/>
+      </w:pPr>
+      <w:r>
+        <w:t xml:space="preserve">Resilience4j provides patterns to </w:t>
+      </w:r>
+      <w:r>
+        <w:rPr>
+          <w:rStyle w:val="Strong"/>
+        </w:rPr>
+        <w:t>prevent cascading failures</w:t>
+      </w:r>
+      <w:r>
+        <w:t>.</w:t>
+      </w:r>
+    </w:p>
+    <w:p/>
+    <w:p/>
+    <w:p>
+      <w:pPr>
+        <w:spacing w:before="100" w:beforeAutospacing="1" w:after="100" w:afterAutospacing="1" w:line="240" w:lineRule="auto"/>
+        <w:rPr>
+          <w:rFonts w:ascii="Times New Roman" w:eastAsia="Times New Roman" w:hAnsi="Times New Roman" w:cs="Times New Roman"/>
+          <w:sz w:val="24"/>
+          <w:szCs w:val="24"/>
+        </w:rPr>
+      </w:pPr>
+      <w:r>
+        <w:rPr>
+          <w:rFonts w:ascii="Courier New" w:eastAsia="Times New Roman" w:hAnsi="Courier New" w:cs="Courier New"/>
+          <w:sz w:val="20"/>
+          <w:szCs w:val="20"/>
+        </w:rPr>
+        <w:t>@</w:t>
+      </w:r>
+      <w:proofErr w:type="spellStart"/>
+      <w:r>
+        <w:rPr>
+          <w:rFonts w:ascii="Courier New" w:eastAsia="Times New Roman" w:hAnsi="Courier New" w:cs="Courier New"/>
+          <w:sz w:val="20"/>
+          <w:szCs w:val="20"/>
+        </w:rPr>
+        <w:t>CrossOrigin</w:t>
+      </w:r>
+      <w:proofErr w:type="spellEnd"/>
+      <w:r>
+        <w:rPr>
+          <w:rFonts w:ascii="Times New Roman" w:eastAsia="Times New Roman" w:hAnsi="Times New Roman" w:cs="Times New Roman"/>
+          <w:sz w:val="24"/>
+          <w:szCs w:val="24"/>
+        </w:rPr>
+        <w:t xml:space="preserve"> is used to </w:t>
+      </w:r>
+      <w:r>
+        <w:rPr>
+          <w:rFonts w:ascii="Times New Roman" w:eastAsia="Times New Roman" w:hAnsi="Times New Roman" w:cs="Times New Roman"/>
+          <w:b/>
+          <w:bCs/>
+          <w:sz w:val="24"/>
+          <w:szCs w:val="24"/>
+        </w:rPr>
+        <w:t>enable CORS (Cross-Origin Resource Sharing)</w:t>
+      </w:r>
+      <w:r>
+        <w:rPr>
+          <w:rFonts w:ascii="Times New Roman" w:eastAsia="Times New Roman" w:hAnsi="Times New Roman" w:cs="Times New Roman"/>
+          <w:sz w:val="24"/>
+          <w:szCs w:val="24"/>
+        </w:rPr>
+        <w:t xml:space="preserve"> so that a frontend from another origin can access your API.</w:t>
+      </w:r>
+    </w:p>
+    <w:p>
+      <w:pPr>
+        <w:spacing w:before="100" w:beforeAutospacing="1" w:after="100" w:afterAutospacing="1" w:line="240" w:lineRule="auto"/>
+        <w:outlineLvl w:val="2"/>
+        <w:rPr>
+          <w:rFonts w:ascii="Times New Roman" w:eastAsia="Times New Roman" w:hAnsi="Times New Roman" w:cs="Times New Roman"/>
+          <w:b/>
+          <w:bCs/>
+          <w:sz w:val="27"/>
+          <w:szCs w:val="27"/>
+        </w:rPr>
+      </w:pPr>
+      <w:r>
+        <w:rPr>
+          <w:rFonts w:ascii="Times New Roman" w:eastAsia="Times New Roman" w:hAnsi="Times New Roman" w:cs="Times New Roman"/>
+          <w:b/>
+          <w:bCs/>
+          <w:sz w:val="27"/>
+          <w:szCs w:val="27"/>
+        </w:rPr>
+        <w:t>Example</w:t>
+      </w:r>
+    </w:p>
+    <w:p>
+      <w:pPr>
+        <w:tabs>
+          <w:tab w:val="left" w:pos="916"/>
+          <w:tab w:val="left" w:pos="1832"/>
+          <w:tab w:val="left" w:pos="2748"/>
+          <w:tab w:val="left" w:pos="3664"/>
+          <w:tab w:val="left" w:pos="4580"/>
+          <w:tab w:val="left" w:pos="5496"/>
+          <w:tab w:val="left" w:pos="6412"/>
+          <w:tab w:val="left" w:pos="7328"/>
+          <w:tab w:val="left" w:pos="8244"/>
+          <w:tab w:val="left" w:pos="9160"/>
+          <w:tab w:val="left" w:pos="10076"/>
+          <w:tab w:val="left" w:pos="10992"/>
+          <w:tab w:val="left" w:pos="11908"/>
+          <w:tab w:val="left" w:pos="12824"/>
+          <w:tab w:val="left" w:pos="13740"/>
+          <w:tab w:val="left" w:pos="14656"/>
+        </w:tabs>
+        <w:spacing w:after="0" w:line="240" w:lineRule="auto"/>
+        <w:rPr>
+          <w:rFonts w:ascii="Courier New" w:eastAsia="Times New Roman" w:hAnsi="Courier New" w:cs="Courier New"/>
+          <w:sz w:val="20"/>
+          <w:szCs w:val="20"/>
+        </w:rPr>
+      </w:pPr>
+      <w:r>
+        <w:rPr>
+          <w:rFonts w:ascii="Courier New" w:eastAsia="Times New Roman" w:hAnsi="Courier New" w:cs="Courier New"/>
+          <w:sz w:val="20"/>
+          <w:szCs w:val="20"/>
+        </w:rPr>
+        <w:t>@</w:t>
+      </w:r>
+      <w:proofErr w:type="spellStart"/>
+      <w:r>
+        <w:rPr>
+          <w:rFonts w:ascii="Courier New" w:eastAsia="Times New Roman" w:hAnsi="Courier New" w:cs="Courier New"/>
+          <w:sz w:val="20"/>
+          <w:szCs w:val="20"/>
+        </w:rPr>
+        <w:t>RestController</w:t>
+      </w:r>
+      <w:proofErr w:type="spellEnd"/>
+      <w:r>
+        <w:rPr>
+          <w:rFonts w:ascii="Courier New" w:eastAsia="Times New Roman" w:hAnsi="Courier New" w:cs="Courier New"/>
+          <w:sz w:val="20"/>
+          <w:szCs w:val="20"/>
+        </w:rPr>
+        <w:br/>
+        <w:t>@</w:t>
+      </w:r>
+      <w:proofErr w:type="spellStart"/>
+      <w:r>
+        <w:rPr>
+          <w:rFonts w:ascii="Courier New" w:eastAsia="Times New Roman" w:hAnsi="Courier New" w:cs="Courier New"/>
+          <w:sz w:val="20"/>
+          <w:szCs w:val="20"/>
+        </w:rPr>
+        <w:t>RequestMapping</w:t>
+      </w:r>
+      <w:proofErr w:type="spellEnd"/>
+      <w:r>
+        <w:rPr>
+          <w:rFonts w:ascii="Courier New" w:eastAsia="Times New Roman" w:hAnsi="Courier New" w:cs="Courier New"/>
+          <w:sz w:val="20"/>
+          <w:szCs w:val="20"/>
+        </w:rPr>
+        <w:t>("/doctor")</w:t>
+      </w:r>
+      <w:r>
+        <w:rPr>
+          <w:rFonts w:ascii="Courier New" w:eastAsia="Times New Roman" w:hAnsi="Courier New" w:cs="Courier New"/>
+          <w:sz w:val="20"/>
+          <w:szCs w:val="20"/>
+        </w:rPr>
+        <w:br/>
+        <w:t>@</w:t>
+      </w:r>
+      <w:proofErr w:type="spellStart"/>
+      <w:r>
+        <w:rPr>
+          <w:rFonts w:ascii="Courier New" w:eastAsia="Times New Roman" w:hAnsi="Courier New" w:cs="Courier New"/>
+          <w:sz w:val="20"/>
+          <w:szCs w:val="20"/>
+        </w:rPr>
+        <w:t>CrossOrigin</w:t>
+      </w:r>
+      <w:proofErr w:type="spellEnd"/>
+      <w:r>
+        <w:rPr>
+          <w:rFonts w:ascii="Courier New" w:eastAsia="Times New Roman" w:hAnsi="Courier New" w:cs="Courier New"/>
+          <w:sz w:val="20"/>
+          <w:szCs w:val="20"/>
+        </w:rPr>
+        <w:t>(origins = "http://localhost:3000")</w:t>
+      </w:r>
+      <w:r>
+        <w:rPr>
+          <w:rFonts w:ascii="Courier New" w:eastAsia="Times New Roman" w:hAnsi="Courier New" w:cs="Courier New"/>
+          <w:sz w:val="20"/>
+          <w:szCs w:val="20"/>
+        </w:rPr>
+        <w:br/>
+        <w:t xml:space="preserve">public class </w:t>
+      </w:r>
+      <w:proofErr w:type="spellStart"/>
+      <w:r>
+        <w:rPr>
+          <w:rFonts w:ascii="Courier New" w:eastAsia="Times New Roman" w:hAnsi="Courier New" w:cs="Courier New"/>
+          <w:sz w:val="20"/>
+          <w:szCs w:val="20"/>
+        </w:rPr>
+        <w:t>DoctorController</w:t>
+      </w:r>
+      <w:proofErr w:type="spellEnd"/>
+      <w:r>
+        <w:rPr>
+          <w:rFonts w:ascii="Courier New" w:eastAsia="Times New Roman" w:hAnsi="Courier New" w:cs="Courier New"/>
+          <w:sz w:val="20"/>
+          <w:szCs w:val="20"/>
+        </w:rPr>
+        <w:t xml:space="preserve"> {</w:t>
+      </w:r>
+      <w:r>
+        <w:rPr>
+          <w:rFonts w:ascii="Courier New" w:eastAsia="Times New Roman" w:hAnsi="Courier New" w:cs="Courier New"/>
+          <w:sz w:val="20"/>
+          <w:szCs w:val="20"/>
+        </w:rPr>
+        <w:br/>
+      </w:r>
+      <w:r>
+        <w:rPr>
+          <w:rFonts w:ascii="Courier New" w:eastAsia="Times New Roman" w:hAnsi="Courier New" w:cs="Courier New"/>
+          <w:sz w:val="20"/>
+          <w:szCs w:val="20"/>
+        </w:rPr>
+        <w:br/>
+        <w:t xml:space="preserve">    @</w:t>
+      </w:r>
+      <w:proofErr w:type="spellStart"/>
+      <w:r>
+        <w:rPr>
+          <w:rFonts w:ascii="Courier New" w:eastAsia="Times New Roman" w:hAnsi="Courier New" w:cs="Courier New"/>
+          <w:sz w:val="20"/>
+          <w:szCs w:val="20"/>
+        </w:rPr>
+        <w:t>GetMapping</w:t>
+      </w:r>
+      <w:proofErr w:type="spellEnd"/>
+      <w:r>
+        <w:rPr>
+          <w:rFonts w:ascii="Courier New" w:eastAsia="Times New Roman" w:hAnsi="Courier New" w:cs="Courier New"/>
+          <w:sz w:val="20"/>
+          <w:szCs w:val="20"/>
+        </w:rPr>
+        <w:t>("/check/{</w:t>
+      </w:r>
+      <w:proofErr w:type="spellStart"/>
+      <w:r>
+        <w:rPr>
+          <w:rFonts w:ascii="Courier New" w:eastAsia="Times New Roman" w:hAnsi="Courier New" w:cs="Courier New"/>
+          <w:sz w:val="20"/>
+          <w:szCs w:val="20"/>
+        </w:rPr>
+        <w:t>doctorId</w:t>
+      </w:r>
+      <w:proofErr w:type="spellEnd"/>
+      <w:r>
+        <w:rPr>
+          <w:rFonts w:ascii="Courier New" w:eastAsia="Times New Roman" w:hAnsi="Courier New" w:cs="Courier New"/>
+          <w:sz w:val="20"/>
+          <w:szCs w:val="20"/>
+        </w:rPr>
+        <w:t>}")</w:t>
+      </w:r>
+      <w:r>
+        <w:rPr>
+          <w:rFonts w:ascii="Courier New" w:eastAsia="Times New Roman" w:hAnsi="Courier New" w:cs="Courier New"/>
+          <w:sz w:val="20"/>
+          <w:szCs w:val="20"/>
+        </w:rPr>
+        <w:br/>
+        <w:t xml:space="preserve">    public </w:t>
+      </w:r>
+      <w:proofErr w:type="spellStart"/>
+      <w:r>
+        <w:rPr>
+          <w:rFonts w:ascii="Courier New" w:eastAsia="Times New Roman" w:hAnsi="Courier New" w:cs="Courier New"/>
+          <w:sz w:val="20"/>
+          <w:szCs w:val="20"/>
+        </w:rPr>
+        <w:t>boolean</w:t>
+      </w:r>
+      <w:proofErr w:type="spellEnd"/>
+      <w:r>
+        <w:rPr>
+          <w:rFonts w:ascii="Courier New" w:eastAsia="Times New Roman" w:hAnsi="Courier New" w:cs="Courier New"/>
+          <w:sz w:val="20"/>
+          <w:szCs w:val="20"/>
+        </w:rPr>
+        <w:t xml:space="preserve"> </w:t>
+      </w:r>
+      <w:proofErr w:type="spellStart"/>
+      <w:r>
+        <w:rPr>
+          <w:rFonts w:ascii="Courier New" w:eastAsia="Times New Roman" w:hAnsi="Courier New" w:cs="Courier New"/>
+          <w:sz w:val="20"/>
+          <w:szCs w:val="20"/>
+        </w:rPr>
+        <w:t>checkDoctor</w:t>
+      </w:r>
+      <w:proofErr w:type="spellEnd"/>
+      <w:r>
+        <w:rPr>
+          <w:rFonts w:ascii="Courier New" w:eastAsia="Times New Roman" w:hAnsi="Courier New" w:cs="Courier New"/>
+          <w:sz w:val="20"/>
+          <w:szCs w:val="20"/>
+        </w:rPr>
+        <w:t>(@</w:t>
+      </w:r>
+      <w:proofErr w:type="spellStart"/>
+      <w:r>
+        <w:rPr>
+          <w:rFonts w:ascii="Courier New" w:eastAsia="Times New Roman" w:hAnsi="Courier New" w:cs="Courier New"/>
+          <w:sz w:val="20"/>
+          <w:szCs w:val="20"/>
+        </w:rPr>
+        <w:t>PathVariable</w:t>
+      </w:r>
+      <w:proofErr w:type="spellEnd"/>
+      <w:r>
+        <w:rPr>
+          <w:rFonts w:ascii="Courier New" w:eastAsia="Times New Roman" w:hAnsi="Courier New" w:cs="Courier New"/>
+          <w:sz w:val="20"/>
+          <w:szCs w:val="20"/>
+        </w:rPr>
+        <w:t xml:space="preserve"> Long </w:t>
+      </w:r>
+      <w:proofErr w:type="spellStart"/>
+      <w:r>
+        <w:rPr>
+          <w:rFonts w:ascii="Courier New" w:eastAsia="Times New Roman" w:hAnsi="Courier New" w:cs="Courier New"/>
+          <w:sz w:val="20"/>
+          <w:szCs w:val="20"/>
+        </w:rPr>
+        <w:t>doctorId</w:t>
+      </w:r>
+      <w:proofErr w:type="spellEnd"/>
+      <w:r>
+        <w:rPr>
+          <w:rFonts w:ascii="Courier New" w:eastAsia="Times New Roman" w:hAnsi="Courier New" w:cs="Courier New"/>
+          <w:sz w:val="20"/>
+          <w:szCs w:val="20"/>
+        </w:rPr>
+        <w:t>) {</w:t>
+      </w:r>
+      <w:r>
+        <w:rPr>
+          <w:rFonts w:ascii="Courier New" w:eastAsia="Times New Roman" w:hAnsi="Courier New" w:cs="Courier New"/>
+          <w:sz w:val="20"/>
+          <w:szCs w:val="20"/>
+        </w:rPr>
+        <w:br/>
+        <w:t xml:space="preserve">        return </w:t>
+      </w:r>
+      <w:proofErr w:type="spellStart"/>
+      <w:r>
+        <w:rPr>
+          <w:rFonts w:ascii="Courier New" w:eastAsia="Times New Roman" w:hAnsi="Courier New" w:cs="Courier New"/>
+          <w:sz w:val="20"/>
+          <w:szCs w:val="20"/>
+        </w:rPr>
+        <w:t>doctorId</w:t>
+      </w:r>
+      <w:proofErr w:type="spellEnd"/>
+      <w:r>
+        <w:rPr>
+          <w:rFonts w:ascii="Courier New" w:eastAsia="Times New Roman" w:hAnsi="Courier New" w:cs="Courier New"/>
+          <w:sz w:val="20"/>
+          <w:szCs w:val="20"/>
+        </w:rPr>
+        <w:t xml:space="preserve"> == 101;</w:t>
+      </w:r>
+      <w:r>
+        <w:rPr>
+          <w:rFonts w:ascii="Courier New" w:eastAsia="Times New Roman" w:hAnsi="Courier New" w:cs="Courier New"/>
+          <w:sz w:val="20"/>
+          <w:szCs w:val="20"/>
+        </w:rPr>
+        <w:br/>
+        <w:t xml:space="preserve">    }</w:t>
+      </w:r>
+      <w:r>
+        <w:rPr>
+          <w:rFonts w:ascii="Courier New" w:eastAsia="Times New Roman" w:hAnsi="Courier New" w:cs="Courier New"/>
+          <w:sz w:val="20"/>
+          <w:szCs w:val="20"/>
+        </w:rPr>
+        <w:br/>
+        <w:t>}</w:t>
+      </w:r>
+    </w:p>
+    <w:p>
+      <w:pPr>
+        <w:spacing w:before="100" w:beforeAutospacing="1" w:after="100" w:afterAutospacing="1" w:line="240" w:lineRule="auto"/>
+        <w:rPr>
+          <w:rFonts w:ascii="Times New Roman" w:eastAsia="Times New Roman" w:hAnsi="Times New Roman" w:cs="Times New Roman"/>
+          <w:sz w:val="24"/>
+          <w:szCs w:val="24"/>
+        </w:rPr>
+      </w:pPr>
+      <w:r>
+        <w:rPr>
+          <w:rFonts w:ascii="Times New Roman" w:eastAsia="Times New Roman" w:hAnsi="Times New Roman" w:cs="Times New Roman"/>
+          <w:sz w:val="24"/>
+          <w:szCs w:val="24"/>
+        </w:rPr>
+        <w:t>This allows requests from:</w:t>
+      </w:r>
+    </w:p>
+    <w:p>
+      <w:pPr>
+        <w:tabs>
+          <w:tab w:val="left" w:pos="916"/>
+          <w:tab w:val="left" w:pos="1832"/>
+          <w:tab w:val="left" w:pos="2748"/>
+          <w:tab w:val="left" w:pos="3664"/>
+          <w:tab w:val="left" w:pos="4580"/>
+          <w:tab w:val="left" w:pos="5496"/>
+          <w:tab w:val="left" w:pos="6412"/>
+          <w:tab w:val="left" w:pos="7328"/>
+          <w:tab w:val="left" w:pos="8244"/>
+          <w:tab w:val="left" w:pos="9160"/>
+          <w:tab w:val="left" w:pos="10076"/>
+          <w:tab w:val="left" w:pos="10992"/>
+          <w:tab w:val="left" w:pos="11908"/>
+          <w:tab w:val="left" w:pos="12824"/>
+          <w:tab w:val="left" w:pos="13740"/>
+          <w:tab w:val="left" w:pos="14656"/>
+        </w:tabs>
+        <w:spacing w:after="0" w:line="240" w:lineRule="auto"/>
+        <w:rPr>
+          <w:rFonts w:ascii="Courier New" w:eastAsia="Times New Roman" w:hAnsi="Courier New" w:cs="Courier New"/>
+          <w:sz w:val="20"/>
+          <w:szCs w:val="20"/>
+        </w:rPr>
+      </w:pPr>
+      <w:r>
+        <w:rPr>
+          <w:rFonts w:ascii="Courier New" w:eastAsia="Times New Roman" w:hAnsi="Courier New" w:cs="Courier New"/>
+          <w:sz w:val="20"/>
+          <w:szCs w:val="20"/>
+        </w:rPr>
+        <w:t>http://localhost:3000</w:t>
+      </w:r>
+    </w:p>
+    <w:p>
+      <w:pPr>
+        <w:spacing w:before="100" w:beforeAutospacing="1" w:after="100" w:afterAutospacing="1" w:line="240" w:lineRule="auto"/>
+        <w:rPr>
+          <w:rFonts w:ascii="Times New Roman" w:eastAsia="Times New Roman" w:hAnsi="Times New Roman" w:cs="Times New Roman"/>
+          <w:sz w:val="24"/>
+          <w:szCs w:val="24"/>
+        </w:rPr>
+      </w:pPr>
+      <w:r>
+        <w:rPr>
+          <w:rFonts w:ascii="Times New Roman" w:eastAsia="Times New Roman" w:hAnsi="Times New Roman" w:cs="Times New Roman"/>
+          <w:sz w:val="24"/>
+          <w:szCs w:val="24"/>
+        </w:rPr>
+        <w:t>Without this, the browser blocks the request due to CORS policy.</w:t>
+      </w:r>
+    </w:p>
+    <w:p/>
+    <w:p>
+      <w:pPr>
+        <w:pStyle w:val="NormalWeb"/>
+      </w:pPr>
+      <w:r>
+        <w:rPr>
+          <w:rStyle w:val="HTMLCode"/>
+        </w:rPr>
+        <w:t>@</w:t>
+      </w:r>
+      <w:proofErr w:type="spellStart"/>
+      <w:r>
+        <w:rPr>
+          <w:rStyle w:val="HTMLCode"/>
+        </w:rPr>
+        <w:t>PreAuthorize</w:t>
+      </w:r>
+      <w:proofErr w:type="spellEnd"/>
+      <w:r>
+        <w:t xml:space="preserve"> is used in </w:t>
+      </w:r>
+      <w:r>
+        <w:rPr>
+          <w:rStyle w:val="Strong"/>
+        </w:rPr>
+        <w:t>Spring Security</w:t>
+      </w:r>
+      <w:r>
+        <w:t xml:space="preserve"> to control </w:t>
+      </w:r>
+      <w:r>
+        <w:rPr>
+          <w:rStyle w:val="Strong"/>
+        </w:rPr>
+        <w:t>who can access a method</w:t>
+      </w:r>
+      <w:r>
+        <w:t xml:space="preserve"> based on roles or permissions.</w:t>
+      </w:r>
+    </w:p>
+    <w:p>
+      <w:pPr>
+        <w:pStyle w:val="NormalWeb"/>
+      </w:pPr>
+      <w:r>
+        <w:t xml:space="preserve">It checks authorization </w:t>
+      </w:r>
+      <w:r>
+        <w:rPr>
+          <w:rStyle w:val="Strong"/>
+        </w:rPr>
+        <w:t>before the method executes</w:t>
+      </w:r>
+      <w:r>
+        <w:t>.</w:t>
+      </w:r>
+    </w:p>
+    <w:p>
+      <w:pPr>
+        <w:pStyle w:val="Heading3"/>
+      </w:pPr>
+      <w:r>
+        <w:t>Example</w:t>
+      </w:r>
+    </w:p>
+    <w:p>
+      <w:pPr>
+        <w:pStyle w:val="HTMLPreformatted"/>
+      </w:pPr>
+      <w:r>
+        <w:lastRenderedPageBreak/>
+        <w:t>@</w:t>
+      </w:r>
+      <w:proofErr w:type="spellStart"/>
+      <w:r>
+        <w:rPr>
+          <w:rStyle w:val="t"/>
+        </w:rPr>
+        <w:t>GetMapping</w:t>
+      </w:r>
+      <w:proofErr w:type="spellEnd"/>
+      <w:r>
+        <w:t>(</w:t>
+      </w:r>
+      <w:r>
+        <w:rPr>
+          <w:rStyle w:val="r"/>
+        </w:rPr>
+        <w:t>"/admin"</w:t>
+      </w:r>
+      <w:r>
+        <w:t>)</w:t>
+      </w:r>
+      <w:r>
+        <w:br/>
+        <w:t>@</w:t>
+      </w:r>
+      <w:proofErr w:type="spellStart"/>
+      <w:r>
+        <w:rPr>
+          <w:rStyle w:val="t"/>
+        </w:rPr>
+        <w:t>PreAuthorize</w:t>
+      </w:r>
+      <w:proofErr w:type="spellEnd"/>
+      <w:r>
+        <w:t>(</w:t>
+      </w:r>
+      <w:r>
+        <w:rPr>
+          <w:rStyle w:val="r"/>
+        </w:rPr>
+        <w:t>"</w:t>
+      </w:r>
+      <w:proofErr w:type="spellStart"/>
+      <w:r>
+        <w:rPr>
+          <w:rStyle w:val="r"/>
+        </w:rPr>
+        <w:t>hasRole</w:t>
+      </w:r>
+      <w:proofErr w:type="spellEnd"/>
+      <w:r>
+        <w:rPr>
+          <w:rStyle w:val="r"/>
+        </w:rPr>
+        <w:t>('ADMIN')"</w:t>
+      </w:r>
+      <w:r>
+        <w:t>)</w:t>
+      </w:r>
+      <w:r>
+        <w:br/>
+      </w:r>
+      <w:r>
+        <w:rPr>
+          <w:rStyle w:val="n"/>
+        </w:rPr>
+        <w:t>public</w:t>
+      </w:r>
+      <w:r>
+        <w:t xml:space="preserve"> </w:t>
+      </w:r>
+      <w:r>
+        <w:rPr>
+          <w:rStyle w:val="t"/>
+        </w:rPr>
+        <w:t>String</w:t>
+      </w:r>
+      <w:r>
+        <w:t xml:space="preserve"> </w:t>
+      </w:r>
+      <w:proofErr w:type="spellStart"/>
+      <w:r>
+        <w:rPr>
+          <w:rStyle w:val="t"/>
+        </w:rPr>
+        <w:t>adminAccess</w:t>
+      </w:r>
+      <w:proofErr w:type="spellEnd"/>
+      <w:r>
+        <w:t>() {</w:t>
+      </w:r>
+      <w:r>
+        <w:br/>
+        <w:t xml:space="preserve">    </w:t>
+      </w:r>
+      <w:r>
+        <w:rPr>
+          <w:rStyle w:val="n"/>
+        </w:rPr>
+        <w:t>return</w:t>
+      </w:r>
+      <w:r>
+        <w:t xml:space="preserve"> </w:t>
+      </w:r>
+      <w:r>
+        <w:rPr>
+          <w:rStyle w:val="r"/>
+        </w:rPr>
+        <w:t>"Welcome Admin"</w:t>
+      </w:r>
+      <w:r>
+        <w:t>;</w:t>
+      </w:r>
+      <w:r>
+        <w:br/>
+        <w:t>}</w:t>
+      </w:r>
+    </w:p>
+    <w:p>
+      <w:pPr>
+        <w:pStyle w:val="NormalWeb"/>
+      </w:pPr>
+      <w:r>
+        <w:t>This means:</w:t>
+      </w:r>
+    </w:p>
+    <w:p>
+      <w:pPr>
+        <w:pStyle w:val="NormalWeb"/>
+        <w:numPr>
+          <w:ilvl w:val="0"/>
+          <w:numId w:val="3"/>
+        </w:numPr>
+      </w:pPr>
+      <w:r>
+        <w:t xml:space="preserve">Only users with role </w:t>
+      </w:r>
+      <w:r>
+        <w:rPr>
+          <w:rStyle w:val="Strong"/>
+        </w:rPr>
+        <w:t>ADMIN</w:t>
+      </w:r>
+      <w:r>
+        <w:t xml:space="preserve"> can access this endpoint.</w:t>
+      </w:r>
+    </w:p>
+    <w:p/>
+    <w:p>
+      <w:pPr>
+        <w:shd w:val="clear" w:color="auto" w:fill="1E1F22"/>
+        <w:spacing w:after="0" w:line="240" w:lineRule="auto"/>
+        <w:rPr>
+          <w:rFonts w:ascii="Consolas" w:eastAsia="Times New Roman" w:hAnsi="Consolas" w:cs="Times New Roman"/>
+          <w:color w:val="CCCCCC"/>
+          <w:sz w:val="20"/>
+          <w:szCs w:val="20"/>
+        </w:rPr>
+      </w:pPr>
+      <w:r>
+        <w:rPr>
+          <w:rFonts w:ascii="Consolas" w:eastAsia="Times New Roman" w:hAnsi="Consolas" w:cs="Times New Roman"/>
+          <w:i/>
+          <w:iCs/>
+          <w:color w:val="A0A0A0"/>
+          <w:sz w:val="20"/>
+          <w:szCs w:val="20"/>
+        </w:rPr>
+        <w:t>@</w:t>
+      </w:r>
+      <w:proofErr w:type="spellStart"/>
+      <w:r>
+        <w:rPr>
+          <w:rFonts w:ascii="Consolas" w:eastAsia="Times New Roman" w:hAnsi="Consolas" w:cs="Times New Roman"/>
+          <w:color w:val="D9E8F7"/>
+          <w:sz w:val="20"/>
+          <w:szCs w:val="20"/>
+          <w:u w:val="single"/>
+        </w:rPr>
+        <w:t>GetMapping</w:t>
+      </w:r>
+      <w:proofErr w:type="spellEnd"/>
+      <w:r>
+        <w:rPr>
+          <w:rFonts w:ascii="Consolas" w:eastAsia="Times New Roman" w:hAnsi="Consolas" w:cs="Times New Roman"/>
+          <w:color w:val="F9FAF4"/>
+          <w:sz w:val="20"/>
+          <w:szCs w:val="20"/>
+        </w:rPr>
+        <w:t>(</w:t>
+      </w:r>
+      <w:r>
+        <w:rPr>
+          <w:rFonts w:ascii="Consolas" w:eastAsia="Times New Roman" w:hAnsi="Consolas" w:cs="Times New Roman"/>
+          <w:color w:val="17C6A3"/>
+          <w:sz w:val="20"/>
+          <w:szCs w:val="20"/>
+        </w:rPr>
+        <w:t>"/doctor"</w:t>
+      </w:r>
+      <w:r>
+        <w:rPr>
+          <w:rFonts w:ascii="Consolas" w:eastAsia="Times New Roman" w:hAnsi="Consolas" w:cs="Times New Roman"/>
+          <w:color w:val="F9FAF4"/>
+          <w:sz w:val="20"/>
+          <w:szCs w:val="20"/>
+        </w:rPr>
+        <w:t>)</w:t>
+      </w:r>
+    </w:p>
+    <w:p>
+      <w:pPr>
+        <w:shd w:val="clear" w:color="auto" w:fill="1E1F22"/>
+        <w:spacing w:after="0" w:line="240" w:lineRule="auto"/>
+        <w:rPr>
+          <w:rFonts w:ascii="Consolas" w:eastAsia="Times New Roman" w:hAnsi="Consolas" w:cs="Times New Roman"/>
+          <w:color w:val="CCCCCC"/>
+          <w:sz w:val="20"/>
+          <w:szCs w:val="20"/>
+        </w:rPr>
+      </w:pPr>
+      <w:r>
+        <w:rPr>
+          <w:rFonts w:ascii="Consolas" w:eastAsia="Times New Roman" w:hAnsi="Consolas" w:cs="Times New Roman"/>
+          <w:i/>
+          <w:iCs/>
+          <w:color w:val="A0A0A0"/>
+          <w:sz w:val="20"/>
+          <w:szCs w:val="20"/>
+        </w:rPr>
+        <w:t>@</w:t>
+      </w:r>
+      <w:proofErr w:type="spellStart"/>
+      <w:r>
+        <w:rPr>
+          <w:rFonts w:ascii="Consolas" w:eastAsia="Times New Roman" w:hAnsi="Consolas" w:cs="Times New Roman"/>
+          <w:color w:val="D9E8F7"/>
+          <w:sz w:val="20"/>
+          <w:szCs w:val="20"/>
+          <w:u w:val="single"/>
+        </w:rPr>
+        <w:t>PreAuthorize</w:t>
+      </w:r>
+      <w:proofErr w:type="spellEnd"/>
+      <w:r>
+        <w:rPr>
+          <w:rFonts w:ascii="Consolas" w:eastAsia="Times New Roman" w:hAnsi="Consolas" w:cs="Times New Roman"/>
+          <w:color w:val="F9FAF4"/>
+          <w:sz w:val="20"/>
+          <w:szCs w:val="20"/>
+        </w:rPr>
+        <w:t>(</w:t>
+      </w:r>
+      <w:r>
+        <w:rPr>
+          <w:rFonts w:ascii="Consolas" w:eastAsia="Times New Roman" w:hAnsi="Consolas" w:cs="Times New Roman"/>
+          <w:color w:val="17C6A3"/>
+          <w:sz w:val="20"/>
+          <w:szCs w:val="20"/>
+        </w:rPr>
+        <w:t>"</w:t>
+      </w:r>
+      <w:proofErr w:type="spellStart"/>
+      <w:r>
+        <w:rPr>
+          <w:rFonts w:ascii="Consolas" w:eastAsia="Times New Roman" w:hAnsi="Consolas" w:cs="Times New Roman"/>
+          <w:color w:val="17C6A3"/>
+          <w:sz w:val="20"/>
+          <w:szCs w:val="20"/>
+        </w:rPr>
+        <w:t>hasAnyRole</w:t>
+      </w:r>
+      <w:proofErr w:type="spellEnd"/>
+      <w:r>
+        <w:rPr>
+          <w:rFonts w:ascii="Consolas" w:eastAsia="Times New Roman" w:hAnsi="Consolas" w:cs="Times New Roman"/>
+          <w:color w:val="17C6A3"/>
+          <w:sz w:val="20"/>
+          <w:szCs w:val="20"/>
+        </w:rPr>
+        <w:t>('ADMIN','DOCTOR')"</w:t>
+      </w:r>
+      <w:r>
+        <w:rPr>
+          <w:rFonts w:ascii="Consolas" w:eastAsia="Times New Roman" w:hAnsi="Consolas" w:cs="Times New Roman"/>
+          <w:color w:val="F9FAF4"/>
+          <w:sz w:val="20"/>
+          <w:szCs w:val="20"/>
+        </w:rPr>
+        <w:t>)</w:t>
+      </w:r>
+    </w:p>
+    <w:p>
+      <w:pPr>
+        <w:shd w:val="clear" w:color="auto" w:fill="1E1F22"/>
+        <w:spacing w:after="0" w:line="240" w:lineRule="auto"/>
+        <w:rPr>
+          <w:rFonts w:ascii="Consolas" w:eastAsia="Times New Roman" w:hAnsi="Consolas" w:cs="Times New Roman"/>
+          <w:color w:val="CCCCCC"/>
+          <w:sz w:val="20"/>
+          <w:szCs w:val="20"/>
+        </w:rPr>
+      </w:pPr>
+      <w:r>
+        <w:rPr>
+          <w:rFonts w:ascii="Consolas" w:eastAsia="Times New Roman" w:hAnsi="Consolas" w:cs="Times New Roman"/>
+          <w:color w:val="CC6C1D"/>
+          <w:sz w:val="20"/>
+          <w:szCs w:val="20"/>
+        </w:rPr>
+        <w:t>public</w:t>
+      </w:r>
+      <w:r>
+        <w:rPr>
+          <w:rFonts w:ascii="Consolas" w:eastAsia="Times New Roman" w:hAnsi="Consolas" w:cs="Times New Roman"/>
+          <w:color w:val="D9E8F7"/>
+          <w:sz w:val="20"/>
+          <w:szCs w:val="20"/>
+        </w:rPr>
+        <w:t xml:space="preserve"> String </w:t>
+      </w:r>
+      <w:proofErr w:type="spellStart"/>
+      <w:r>
+        <w:rPr>
+          <w:rFonts w:ascii="Consolas" w:eastAsia="Times New Roman" w:hAnsi="Consolas" w:cs="Times New Roman"/>
+          <w:color w:val="D9E8F7"/>
+          <w:sz w:val="20"/>
+          <w:szCs w:val="20"/>
+        </w:rPr>
+        <w:t>doctorAccess</w:t>
+      </w:r>
+      <w:proofErr w:type="spellEnd"/>
+      <w:r>
+        <w:rPr>
+          <w:rFonts w:ascii="Consolas" w:eastAsia="Times New Roman" w:hAnsi="Consolas" w:cs="Times New Roman"/>
+          <w:color w:val="F9FAF4"/>
+          <w:sz w:val="20"/>
+          <w:szCs w:val="20"/>
+        </w:rPr>
+        <w:t>()</w:t>
+      </w:r>
+      <w:r>
+        <w:rPr>
+          <w:rFonts w:ascii="Consolas" w:eastAsia="Times New Roman" w:hAnsi="Consolas" w:cs="Times New Roman"/>
+          <w:color w:val="D9E8F7"/>
+          <w:sz w:val="20"/>
+          <w:szCs w:val="20"/>
+        </w:rPr>
+        <w:t xml:space="preserve"> </w:t>
+      </w:r>
+      <w:r>
+        <w:rPr>
+          <w:rFonts w:ascii="Consolas" w:eastAsia="Times New Roman" w:hAnsi="Consolas" w:cs="Times New Roman"/>
+          <w:color w:val="F9FAF4"/>
+          <w:sz w:val="20"/>
+          <w:szCs w:val="20"/>
+        </w:rPr>
+        <w:t>{</w:t>
+      </w:r>
+    </w:p>
+    <w:p>
+      <w:pPr>
+        <w:shd w:val="clear" w:color="auto" w:fill="1E1F22"/>
+        <w:spacing w:after="0" w:line="240" w:lineRule="auto"/>
+        <w:rPr>
+          <w:rFonts w:ascii="Consolas" w:eastAsia="Times New Roman" w:hAnsi="Consolas" w:cs="Times New Roman"/>
+          <w:color w:val="CCCCCC"/>
+          <w:sz w:val="20"/>
+          <w:szCs w:val="20"/>
+        </w:rPr>
+      </w:pPr>
+      <w:r>
+        <w:rPr>
+          <w:rFonts w:ascii="Consolas" w:eastAsia="Times New Roman" w:hAnsi="Consolas" w:cs="Times New Roman"/>
+          <w:color w:val="D9E8F7"/>
+          <w:sz w:val="20"/>
+          <w:szCs w:val="20"/>
+        </w:rPr>
+        <w:t xml:space="preserve">    </w:t>
+      </w:r>
+      <w:r>
+        <w:rPr>
+          <w:rFonts w:ascii="Consolas" w:eastAsia="Times New Roman" w:hAnsi="Consolas" w:cs="Times New Roman"/>
+          <w:color w:val="CC6C1D"/>
+          <w:sz w:val="20"/>
+          <w:szCs w:val="20"/>
+        </w:rPr>
+        <w:t>return</w:t>
+      </w:r>
+      <w:r>
+        <w:rPr>
+          <w:rFonts w:ascii="Consolas" w:eastAsia="Times New Roman" w:hAnsi="Consolas" w:cs="Times New Roman"/>
+          <w:color w:val="D9E8F7"/>
+          <w:sz w:val="20"/>
+          <w:szCs w:val="20"/>
+        </w:rPr>
+        <w:t xml:space="preserve"> </w:t>
+      </w:r>
+      <w:r>
+        <w:rPr>
+          <w:rFonts w:ascii="Consolas" w:eastAsia="Times New Roman" w:hAnsi="Consolas" w:cs="Times New Roman"/>
+          <w:color w:val="17C6A3"/>
+          <w:sz w:val="20"/>
+          <w:szCs w:val="20"/>
+        </w:rPr>
+        <w:t>"Doctor information"</w:t>
+      </w:r>
+      <w:r>
+        <w:rPr>
+          <w:rFonts w:ascii="Consolas" w:eastAsia="Times New Roman" w:hAnsi="Consolas" w:cs="Times New Roman"/>
+          <w:color w:val="E6E6FA"/>
+          <w:sz w:val="20"/>
+          <w:szCs w:val="20"/>
+        </w:rPr>
+        <w:t>;</w:t>
+      </w:r>
+    </w:p>
+    <w:p>
+      <w:pPr>
+        <w:shd w:val="clear" w:color="auto" w:fill="1E1F22"/>
+        <w:spacing w:after="0" w:line="240" w:lineRule="auto"/>
+        <w:rPr>
+          <w:rFonts w:ascii="Consolas" w:eastAsia="Times New Roman" w:hAnsi="Consolas" w:cs="Times New Roman"/>
+          <w:color w:val="CCCCCC"/>
+          <w:sz w:val="20"/>
+          <w:szCs w:val="20"/>
+        </w:rPr>
+      </w:pPr>
+      <w:r>
+        <w:rPr>
+          <w:rFonts w:ascii="Consolas" w:eastAsia="Times New Roman" w:hAnsi="Consolas" w:cs="Times New Roman"/>
+          <w:color w:val="F9FAF4"/>
+          <w:sz w:val="20"/>
+          <w:szCs w:val="20"/>
+          <w:u w:val="single"/>
+        </w:rPr>
+        <w:t>}</w:t>
+      </w:r>
+    </w:p>
+    <w:p/>
+    <w:p>
+      <w:pPr>
+        <w:pStyle w:val="NormalWeb"/>
+      </w:pPr>
+      <w:r>
+        <w:t>Admin, and doctor can only access this method</w:t>
+      </w:r>
+      <w:r>
+        <w:br/>
+      </w:r>
+      <w:r>
+        <w:br/>
+      </w:r>
+      <w:r>
+        <w:rPr>
+          <w:rFonts w:ascii="Courier New" w:hAnsi="Courier New" w:cs="Courier New"/>
+          <w:b/>
+          <w:sz w:val="20"/>
+          <w:szCs w:val="20"/>
+        </w:rPr>
+        <w:t>@</w:t>
+      </w:r>
+      <w:proofErr w:type="spellStart"/>
+      <w:r>
+        <w:rPr>
+          <w:rFonts w:ascii="Courier New" w:hAnsi="Courier New" w:cs="Courier New"/>
+          <w:b/>
+          <w:sz w:val="20"/>
+          <w:szCs w:val="20"/>
+        </w:rPr>
+        <w:t>PostAuthorize</w:t>
+      </w:r>
+      <w:proofErr w:type="spellEnd"/>
+      <w:r>
+        <w:t xml:space="preserve"> is a </w:t>
+      </w:r>
+      <w:r>
+        <w:rPr>
+          <w:b/>
+          <w:bCs/>
+        </w:rPr>
+        <w:t>Spring Security annotation</w:t>
+      </w:r>
+      <w:r>
+        <w:t xml:space="preserve"> used to perform </w:t>
+      </w:r>
+      <w:r>
+        <w:rPr>
+          <w:b/>
+          <w:bCs/>
+        </w:rPr>
+        <w:t>authorization checks after a method executes</w:t>
+      </w:r>
+      <w:r>
+        <w:t>.</w:t>
+      </w:r>
+    </w:p>
+    <w:p>
+      <w:pPr>
+        <w:spacing w:before="100" w:beforeAutospacing="1" w:after="100" w:afterAutospacing="1" w:line="240" w:lineRule="auto"/>
+        <w:rPr>
+          <w:rFonts w:ascii="Times New Roman" w:eastAsia="Times New Roman" w:hAnsi="Times New Roman" w:cs="Times New Roman"/>
+          <w:sz w:val="24"/>
+          <w:szCs w:val="24"/>
+        </w:rPr>
+      </w:pPr>
+      <w:r>
+        <w:rPr>
+          <w:rFonts w:ascii="Times New Roman" w:eastAsia="Times New Roman" w:hAnsi="Times New Roman" w:cs="Times New Roman"/>
+          <w:sz w:val="24"/>
+          <w:szCs w:val="24"/>
+        </w:rPr>
+        <w:t xml:space="preserve">It allows Spring Security to </w:t>
+      </w:r>
+      <w:r>
+        <w:rPr>
+          <w:rFonts w:ascii="Times New Roman" w:eastAsia="Times New Roman" w:hAnsi="Times New Roman" w:cs="Times New Roman"/>
+          <w:b/>
+          <w:bCs/>
+          <w:sz w:val="24"/>
+          <w:szCs w:val="24"/>
+        </w:rPr>
+        <w:t>inspect the returned object and then decide whether the user is allowed to access it</w:t>
+      </w:r>
+      <w:r>
+        <w:rPr>
+          <w:rFonts w:ascii="Times New Roman" w:eastAsia="Times New Roman" w:hAnsi="Times New Roman" w:cs="Times New Roman"/>
+          <w:sz w:val="24"/>
+          <w:szCs w:val="24"/>
+        </w:rPr>
+        <w:t>.</w:t>
+      </w:r>
+    </w:p>
+    <w:p>
+      <w:r>
+        <w:t>Method Executes</w:t>
+      </w:r>
+    </w:p>
+    <w:p>
+      <w:r>
+        <w:t xml:space="preserve">      ↓</w:t>
+      </w:r>
+    </w:p>
+    <w:p>
+      <w:r>
+        <w:t>Return Object</w:t>
+      </w:r>
+    </w:p>
+    <w:p>
+      <w:r>
+        <w:t xml:space="preserve">      ↓</w:t>
+      </w:r>
+    </w:p>
+    <w:p>
+      <w:r>
+        <w:t>@</w:t>
+      </w:r>
+      <w:proofErr w:type="spellStart"/>
+      <w:r>
+        <w:t>PostAuthorize</w:t>
+      </w:r>
+      <w:proofErr w:type="spellEnd"/>
+      <w:r>
+        <w:t xml:space="preserve"> condition checked</w:t>
+      </w:r>
+    </w:p>
+    <w:p>
+      <w:r>
+        <w:t xml:space="preserve">      ↓</w:t>
+      </w:r>
+    </w:p>
+    <w:p>
+      <w:r>
+        <w:t>Allowed OR Access Denied</w:t>
+      </w:r>
+    </w:p>
+    <w:p/>
+    <w:p>
+      <w:pPr>
+        <w:shd w:val="clear" w:color="auto" w:fill="1E1F22"/>
+        <w:spacing w:after="0" w:line="240" w:lineRule="auto"/>
+        <w:rPr>
+          <w:rFonts w:ascii="Consolas" w:eastAsia="Times New Roman" w:hAnsi="Consolas" w:cs="Times New Roman"/>
+          <w:color w:val="CCCCCC"/>
+          <w:sz w:val="20"/>
+          <w:szCs w:val="20"/>
+        </w:rPr>
+      </w:pPr>
+      <w:r>
+        <w:rPr>
+          <w:rFonts w:ascii="Consolas" w:eastAsia="Times New Roman" w:hAnsi="Consolas" w:cs="Times New Roman"/>
+          <w:i/>
+          <w:iCs/>
+          <w:color w:val="A0A0A0"/>
+          <w:sz w:val="20"/>
+          <w:szCs w:val="20"/>
+        </w:rPr>
+        <w:t>@</w:t>
+      </w:r>
+      <w:proofErr w:type="spellStart"/>
+      <w:r>
+        <w:rPr>
+          <w:rFonts w:ascii="Consolas" w:eastAsia="Times New Roman" w:hAnsi="Consolas" w:cs="Times New Roman"/>
+          <w:color w:val="D9E8F7"/>
+          <w:sz w:val="20"/>
+          <w:szCs w:val="20"/>
+          <w:u w:val="single"/>
+        </w:rPr>
+        <w:t>GetMapping</w:t>
+      </w:r>
+      <w:proofErr w:type="spellEnd"/>
+      <w:r>
+        <w:rPr>
+          <w:rFonts w:ascii="Consolas" w:eastAsia="Times New Roman" w:hAnsi="Consolas" w:cs="Times New Roman"/>
+          <w:color w:val="F9FAF4"/>
+          <w:sz w:val="20"/>
+          <w:szCs w:val="20"/>
+        </w:rPr>
+        <w:t>(</w:t>
+      </w:r>
+      <w:r>
+        <w:rPr>
+          <w:rFonts w:ascii="Consolas" w:eastAsia="Times New Roman" w:hAnsi="Consolas" w:cs="Times New Roman"/>
+          <w:color w:val="17C6A3"/>
+          <w:sz w:val="20"/>
+          <w:szCs w:val="20"/>
+        </w:rPr>
+        <w:t>"/patient/{id}"</w:t>
+      </w:r>
+      <w:r>
+        <w:rPr>
+          <w:rFonts w:ascii="Consolas" w:eastAsia="Times New Roman" w:hAnsi="Consolas" w:cs="Times New Roman"/>
+          <w:color w:val="F9FAF4"/>
+          <w:sz w:val="20"/>
+          <w:szCs w:val="20"/>
+        </w:rPr>
+        <w:t>)</w:t>
+      </w:r>
+    </w:p>
+    <w:p>
+      <w:pPr>
+        <w:shd w:val="clear" w:color="auto" w:fill="1E1F22"/>
+        <w:spacing w:after="0" w:line="240" w:lineRule="auto"/>
+        <w:rPr>
+          <w:rFonts w:ascii="Consolas" w:eastAsia="Times New Roman" w:hAnsi="Consolas" w:cs="Times New Roman"/>
+          <w:color w:val="CCCCCC"/>
+          <w:sz w:val="20"/>
+          <w:szCs w:val="20"/>
+        </w:rPr>
+      </w:pPr>
+      <w:r>
+        <w:rPr>
+          <w:rFonts w:ascii="Consolas" w:eastAsia="Times New Roman" w:hAnsi="Consolas" w:cs="Times New Roman"/>
+          <w:i/>
+          <w:iCs/>
+          <w:color w:val="A0A0A0"/>
+          <w:sz w:val="20"/>
+          <w:szCs w:val="20"/>
+        </w:rPr>
+        <w:t>@</w:t>
+      </w:r>
+      <w:proofErr w:type="spellStart"/>
+      <w:r>
+        <w:rPr>
+          <w:rFonts w:ascii="Consolas" w:eastAsia="Times New Roman" w:hAnsi="Consolas" w:cs="Times New Roman"/>
+          <w:color w:val="D9E8F7"/>
+          <w:sz w:val="20"/>
+          <w:szCs w:val="20"/>
+          <w:u w:val="single"/>
+        </w:rPr>
+        <w:t>PostAuthorize</w:t>
+      </w:r>
+      <w:proofErr w:type="spellEnd"/>
+      <w:r>
+        <w:rPr>
+          <w:rFonts w:ascii="Consolas" w:eastAsia="Times New Roman" w:hAnsi="Consolas" w:cs="Times New Roman"/>
+          <w:color w:val="F9FAF4"/>
+          <w:sz w:val="20"/>
+          <w:szCs w:val="20"/>
+        </w:rPr>
+        <w:t>(</w:t>
+      </w:r>
+      <w:r>
+        <w:rPr>
+          <w:rFonts w:ascii="Consolas" w:eastAsia="Times New Roman" w:hAnsi="Consolas" w:cs="Times New Roman"/>
+          <w:color w:val="17C6A3"/>
+          <w:sz w:val="20"/>
+          <w:szCs w:val="20"/>
+        </w:rPr>
+        <w:t>"returnObject.name == authentication.name"</w:t>
+      </w:r>
+      <w:r>
+        <w:rPr>
+          <w:rFonts w:ascii="Consolas" w:eastAsia="Times New Roman" w:hAnsi="Consolas" w:cs="Times New Roman"/>
+          <w:color w:val="F9FAF4"/>
+          <w:sz w:val="20"/>
+          <w:szCs w:val="20"/>
+        </w:rPr>
+        <w:t>)</w:t>
+      </w:r>
+    </w:p>
+    <w:p>
+      <w:pPr>
+        <w:shd w:val="clear" w:color="auto" w:fill="1E1F22"/>
+        <w:spacing w:after="0" w:line="240" w:lineRule="auto"/>
+        <w:rPr>
+          <w:rFonts w:ascii="Consolas" w:eastAsia="Times New Roman" w:hAnsi="Consolas" w:cs="Times New Roman"/>
+          <w:color w:val="CCCCCC"/>
+          <w:sz w:val="20"/>
+          <w:szCs w:val="20"/>
+        </w:rPr>
+      </w:pPr>
+      <w:r>
+        <w:rPr>
+          <w:rFonts w:ascii="Consolas" w:eastAsia="Times New Roman" w:hAnsi="Consolas" w:cs="Times New Roman"/>
+          <w:color w:val="CC6C1D"/>
+          <w:sz w:val="20"/>
+          <w:szCs w:val="20"/>
+        </w:rPr>
+        <w:t>public</w:t>
+      </w:r>
+      <w:r>
+        <w:rPr>
+          <w:rFonts w:ascii="Consolas" w:eastAsia="Times New Roman" w:hAnsi="Consolas" w:cs="Times New Roman"/>
+          <w:color w:val="D9E8F7"/>
+          <w:sz w:val="20"/>
+          <w:szCs w:val="20"/>
+        </w:rPr>
+        <w:t xml:space="preserve"> </w:t>
+      </w:r>
+      <w:r>
+        <w:rPr>
+          <w:rFonts w:ascii="Consolas" w:eastAsia="Times New Roman" w:hAnsi="Consolas" w:cs="Times New Roman"/>
+          <w:color w:val="D9E8F7"/>
+          <w:sz w:val="20"/>
+          <w:szCs w:val="20"/>
+          <w:u w:val="single"/>
+        </w:rPr>
+        <w:t>Patient</w:t>
+      </w:r>
+      <w:r>
+        <w:rPr>
+          <w:rFonts w:ascii="Consolas" w:eastAsia="Times New Roman" w:hAnsi="Consolas" w:cs="Times New Roman"/>
+          <w:color w:val="D9E8F7"/>
+          <w:sz w:val="20"/>
+          <w:szCs w:val="20"/>
+        </w:rPr>
+        <w:t xml:space="preserve"> </w:t>
+      </w:r>
+      <w:proofErr w:type="spellStart"/>
+      <w:r>
+        <w:rPr>
+          <w:rFonts w:ascii="Consolas" w:eastAsia="Times New Roman" w:hAnsi="Consolas" w:cs="Times New Roman"/>
+          <w:color w:val="D9E8F7"/>
+          <w:sz w:val="20"/>
+          <w:szCs w:val="20"/>
+        </w:rPr>
+        <w:t>getPatient</w:t>
+      </w:r>
+      <w:proofErr w:type="spellEnd"/>
+      <w:r>
+        <w:rPr>
+          <w:rFonts w:ascii="Consolas" w:eastAsia="Times New Roman" w:hAnsi="Consolas" w:cs="Times New Roman"/>
+          <w:color w:val="F9FAF4"/>
+          <w:sz w:val="20"/>
+          <w:szCs w:val="20"/>
+        </w:rPr>
+        <w:t>(</w:t>
+      </w:r>
+      <w:r>
+        <w:rPr>
+          <w:rFonts w:ascii="Consolas" w:eastAsia="Times New Roman" w:hAnsi="Consolas" w:cs="Times New Roman"/>
+          <w:i/>
+          <w:iCs/>
+          <w:color w:val="A0A0A0"/>
+          <w:sz w:val="20"/>
+          <w:szCs w:val="20"/>
+        </w:rPr>
+        <w:t>@</w:t>
+      </w:r>
+      <w:proofErr w:type="spellStart"/>
+      <w:r>
+        <w:rPr>
+          <w:rFonts w:ascii="Consolas" w:eastAsia="Times New Roman" w:hAnsi="Consolas" w:cs="Times New Roman"/>
+          <w:color w:val="D9E8F7"/>
+          <w:sz w:val="20"/>
+          <w:szCs w:val="20"/>
+          <w:u w:val="single"/>
+        </w:rPr>
+        <w:t>PathVariable</w:t>
+      </w:r>
+      <w:proofErr w:type="spellEnd"/>
+      <w:r>
+        <w:rPr>
+          <w:rFonts w:ascii="Consolas" w:eastAsia="Times New Roman" w:hAnsi="Consolas" w:cs="Times New Roman"/>
+          <w:color w:val="D9E8F7"/>
+          <w:sz w:val="20"/>
+          <w:szCs w:val="20"/>
+        </w:rPr>
+        <w:t xml:space="preserve"> Long id</w:t>
+      </w:r>
+      <w:r>
+        <w:rPr>
+          <w:rFonts w:ascii="Consolas" w:eastAsia="Times New Roman" w:hAnsi="Consolas" w:cs="Times New Roman"/>
+          <w:color w:val="F9FAF4"/>
+          <w:sz w:val="20"/>
+          <w:szCs w:val="20"/>
+        </w:rPr>
+        <w:t>){</w:t>
+      </w:r>
+    </w:p>
+    <w:p>
+      <w:pPr>
+        <w:shd w:val="clear" w:color="auto" w:fill="1E1F22"/>
+        <w:spacing w:after="0" w:line="240" w:lineRule="auto"/>
+        <w:rPr>
+          <w:rFonts w:ascii="Consolas" w:eastAsia="Times New Roman" w:hAnsi="Consolas" w:cs="Times New Roman"/>
+          <w:color w:val="CCCCCC"/>
+          <w:sz w:val="20"/>
+          <w:szCs w:val="20"/>
+        </w:rPr>
+      </w:pPr>
+      <w:r>
+        <w:rPr>
+          <w:rFonts w:ascii="Consolas" w:eastAsia="Times New Roman" w:hAnsi="Consolas" w:cs="Times New Roman"/>
+          <w:color w:val="D9E8F7"/>
+          <w:sz w:val="20"/>
+          <w:szCs w:val="20"/>
+        </w:rPr>
+        <w:t xml:space="preserve">    </w:t>
+      </w:r>
+      <w:r>
+        <w:rPr>
+          <w:rFonts w:ascii="Consolas" w:eastAsia="Times New Roman" w:hAnsi="Consolas" w:cs="Times New Roman"/>
+          <w:color w:val="CC6C1D"/>
+          <w:sz w:val="20"/>
+          <w:szCs w:val="20"/>
+        </w:rPr>
+        <w:t>return</w:t>
+      </w:r>
+      <w:r>
+        <w:rPr>
+          <w:rFonts w:ascii="Consolas" w:eastAsia="Times New Roman" w:hAnsi="Consolas" w:cs="Times New Roman"/>
+          <w:color w:val="D9E8F7"/>
+          <w:sz w:val="20"/>
+          <w:szCs w:val="20"/>
+        </w:rPr>
+        <w:t xml:space="preserve"> </w:t>
+      </w:r>
+      <w:proofErr w:type="spellStart"/>
+      <w:r>
+        <w:rPr>
+          <w:rFonts w:ascii="Consolas" w:eastAsia="Times New Roman" w:hAnsi="Consolas" w:cs="Times New Roman"/>
+          <w:color w:val="D9E8F7"/>
+          <w:sz w:val="20"/>
+          <w:szCs w:val="20"/>
+          <w:u w:val="single"/>
+        </w:rPr>
+        <w:t>patientService</w:t>
+      </w:r>
+      <w:r>
+        <w:rPr>
+          <w:rFonts w:ascii="Consolas" w:eastAsia="Times New Roman" w:hAnsi="Consolas" w:cs="Times New Roman"/>
+          <w:color w:val="E6E6FA"/>
+          <w:sz w:val="20"/>
+          <w:szCs w:val="20"/>
+        </w:rPr>
+        <w:t>.</w:t>
+      </w:r>
+      <w:r>
+        <w:rPr>
+          <w:rFonts w:ascii="Consolas" w:eastAsia="Times New Roman" w:hAnsi="Consolas" w:cs="Times New Roman"/>
+          <w:color w:val="D9E8F7"/>
+          <w:sz w:val="20"/>
+          <w:szCs w:val="20"/>
+        </w:rPr>
+        <w:t>getPatient</w:t>
+      </w:r>
+      <w:proofErr w:type="spellEnd"/>
+      <w:r>
+        <w:rPr>
+          <w:rFonts w:ascii="Consolas" w:eastAsia="Times New Roman" w:hAnsi="Consolas" w:cs="Times New Roman"/>
+          <w:color w:val="F9FAF4"/>
+          <w:sz w:val="20"/>
+          <w:szCs w:val="20"/>
+        </w:rPr>
+        <w:t>(</w:t>
+      </w:r>
+      <w:r>
+        <w:rPr>
+          <w:rFonts w:ascii="Consolas" w:eastAsia="Times New Roman" w:hAnsi="Consolas" w:cs="Times New Roman"/>
+          <w:color w:val="D9E8F7"/>
+          <w:sz w:val="20"/>
+          <w:szCs w:val="20"/>
+        </w:rPr>
+        <w:t>id</w:t>
+      </w:r>
+      <w:r>
+        <w:rPr>
+          <w:rFonts w:ascii="Consolas" w:eastAsia="Times New Roman" w:hAnsi="Consolas" w:cs="Times New Roman"/>
+          <w:color w:val="F9FAF4"/>
+          <w:sz w:val="20"/>
+          <w:szCs w:val="20"/>
+        </w:rPr>
+        <w:t>)</w:t>
+      </w:r>
+      <w:r>
+        <w:rPr>
+          <w:rFonts w:ascii="Consolas" w:eastAsia="Times New Roman" w:hAnsi="Consolas" w:cs="Times New Roman"/>
+          <w:color w:val="E6E6FA"/>
+          <w:sz w:val="20"/>
+          <w:szCs w:val="20"/>
+        </w:rPr>
+        <w:t>;</w:t>
+      </w:r>
+    </w:p>
+    <w:p>
+      <w:pPr>
+        <w:shd w:val="clear" w:color="auto" w:fill="1E1F22"/>
+        <w:spacing w:after="0" w:line="240" w:lineRule="auto"/>
+        <w:rPr>
+          <w:rFonts w:ascii="Consolas" w:eastAsia="Times New Roman" w:hAnsi="Consolas" w:cs="Times New Roman"/>
+          <w:color w:val="CCCCCC"/>
+          <w:sz w:val="20"/>
+          <w:szCs w:val="20"/>
+        </w:rPr>
+      </w:pPr>
+      <w:r>
+        <w:rPr>
+          <w:rFonts w:ascii="Consolas" w:eastAsia="Times New Roman" w:hAnsi="Consolas" w:cs="Times New Roman"/>
+          <w:color w:val="F9FAF4"/>
+          <w:sz w:val="20"/>
+          <w:szCs w:val="20"/>
+          <w:u w:val="single"/>
+        </w:rPr>
+        <w:t>}</w:t>
+      </w:r>
+    </w:p>
+    <w:p/>
+    <w:p/>
+    <w:p>
+      <w:pPr>
+        <w:spacing w:before="100" w:beforeAutospacing="1" w:after="100" w:afterAutospacing="1" w:line="240" w:lineRule="auto"/>
+        <w:rPr>
+          <w:rFonts w:ascii="Times New Roman" w:eastAsia="Times New Roman" w:hAnsi="Times New Roman" w:cs="Times New Roman"/>
+          <w:sz w:val="24"/>
+          <w:szCs w:val="24"/>
+        </w:rPr>
+      </w:pPr>
+      <w:r>
+        <w:rPr>
+          <w:rFonts w:ascii="Times New Roman" w:eastAsia="Times New Roman" w:hAnsi="Times New Roman" w:cs="Times New Roman"/>
+          <w:b/>
+          <w:bCs/>
+          <w:sz w:val="24"/>
+          <w:szCs w:val="24"/>
+        </w:rPr>
+        <w:lastRenderedPageBreak/>
+        <w:t>CSRF (Cross-Site Request Forgery)</w:t>
+      </w:r>
+      <w:r>
+        <w:rPr>
+          <w:rFonts w:ascii="Times New Roman" w:eastAsia="Times New Roman" w:hAnsi="Times New Roman" w:cs="Times New Roman"/>
+          <w:sz w:val="24"/>
+          <w:szCs w:val="24"/>
+        </w:rPr>
+        <w:t xml:space="preserve"> is a security attack where a malicious website tricks a logged-in user’s browser into sending </w:t>
+      </w:r>
+      <w:r>
+        <w:rPr>
+          <w:rFonts w:ascii="Times New Roman" w:eastAsia="Times New Roman" w:hAnsi="Times New Roman" w:cs="Times New Roman"/>
+          <w:b/>
+          <w:bCs/>
+          <w:sz w:val="24"/>
+          <w:szCs w:val="24"/>
+        </w:rPr>
+        <w:t>unauthorized requests</w:t>
+      </w:r>
+      <w:r>
+        <w:rPr>
+          <w:rFonts w:ascii="Times New Roman" w:eastAsia="Times New Roman" w:hAnsi="Times New Roman" w:cs="Times New Roman"/>
+          <w:sz w:val="24"/>
+          <w:szCs w:val="24"/>
+        </w:rPr>
+        <w:t xml:space="preserve"> to another application.</w:t>
+      </w:r>
+    </w:p>
+    <w:p>
+      <w:pPr>
+        <w:spacing w:before="100" w:beforeAutospacing="1" w:after="100" w:afterAutospacing="1" w:line="240" w:lineRule="auto"/>
+        <w:rPr>
+          <w:rFonts w:ascii="Times New Roman" w:eastAsia="Times New Roman" w:hAnsi="Times New Roman" w:cs="Times New Roman"/>
+          <w:sz w:val="24"/>
+          <w:szCs w:val="24"/>
+        </w:rPr>
+      </w:pPr>
+      <w:r>
+        <w:rPr>
+          <w:rFonts w:ascii="Times New Roman" w:eastAsia="Times New Roman" w:hAnsi="Times New Roman" w:cs="Times New Roman"/>
+          <w:sz w:val="24"/>
+          <w:szCs w:val="24"/>
+        </w:rPr>
+        <w:t xml:space="preserve">Spring Security has </w:t>
+      </w:r>
+      <w:r>
+        <w:rPr>
+          <w:rFonts w:ascii="Times New Roman" w:eastAsia="Times New Roman" w:hAnsi="Times New Roman" w:cs="Times New Roman"/>
+          <w:b/>
+          <w:bCs/>
+          <w:sz w:val="24"/>
+          <w:szCs w:val="24"/>
+        </w:rPr>
+        <w:t>CSRF protection enabled by default</w:t>
+      </w:r>
+      <w:r>
+        <w:rPr>
+          <w:rFonts w:ascii="Times New Roman" w:eastAsia="Times New Roman" w:hAnsi="Times New Roman" w:cs="Times New Roman"/>
+          <w:sz w:val="24"/>
+          <w:szCs w:val="24"/>
+        </w:rPr>
+        <w:t xml:space="preserve"> to prevent this attack.</w:t>
+      </w:r>
+    </w:p>
+    <w:p/>
+    <w:p>
+      <w:r>
+        <w:t>AMQP (Advanced Message Queuing Protocol) is an open-standard,</w:t>
+      </w:r>
+    </w:p>
+    <w:p>
+      <w:r>
+        <w:t xml:space="preserve">       wire-level protocol that serves as the core communication</w:t>
+      </w:r>
+    </w:p>
+    <w:p>
+      <w:r>
+        <w:t xml:space="preserve">        foundation for </w:t>
+      </w:r>
+      <w:proofErr w:type="spellStart"/>
+      <w:r>
+        <w:t>RabbitMQ</w:t>
+      </w:r>
+      <w:proofErr w:type="spellEnd"/>
+      <w:r>
+        <w:t xml:space="preserve">. It provides a standardized and </w:t>
+      </w:r>
+    </w:p>
+    <w:p>
+      <w:r>
+        <w:t xml:space="preserve">        reliable  way for applications written in different </w:t>
+      </w:r>
+    </w:p>
+    <w:p>
+      <w:r>
+        <w:t xml:space="preserve">        programming languages and running on different platforms </w:t>
+      </w:r>
+    </w:p>
+    <w:p>
+      <w:r>
+        <w:t xml:space="preserve">      to communicate by sending and receiving messages.</w:t>
+      </w:r>
+      <w:bookmarkStart w:id="0" w:name="_GoBack"/>
+      <w:bookmarkEnd w:id="0"/>
     </w:p>
     <w:sectPr>
       <w:pgSz w:w="12240" w:h="15840"/>
@@ -5302,6 +7691,304 @@
 <file path=word/numbering.xml><?xml version="1.0" encoding="utf-8"?>
 <w:numbering xmlns:wpc="http://schemas.microsoft.com/office/word/2010/wordprocessingCanvas" xmlns:cx="http://schemas.microsoft.com/office/drawing/2014/chartex" xmlns:mc="http://schemas.openxmlformats.org/markup-compatibility/2006" xmlns:o="urn:schemas-microsoft-com:office:office" xmlns:r="http://schemas.openxmlformats.org/officeDocument/2006/relationships" xmlns:m="http://schemas.openxmlformats.org/officeDocument/2006/math" xmlns:v="urn:schemas-microsoft-com:vml" xmlns:wp14="http://schemas.microsoft.com/office/word/2010/wordprocessingDrawing" xmlns:wp="http://schemas.openxmlformats.org/drawingml/2006/wordprocessingDrawing" xmlns:w10="urn:schemas-microsoft-com:office:word" xmlns:w="http://schemas.openxmlformats.org/wordprocessingml/2006/main" xmlns:w14="http://schemas.microsoft.com/office/word/2010/wordml" xmlns:w15="http://schemas.microsoft.com/office/word/2012/wordml" xmlns:w16se="http://schemas.microsoft.com/office/word/2015/wordml/symex" xmlns:wpg="http://schemas.microsoft.com/office/word/2010/wordprocessingGroup" xmlns:wpi="http://schemas.microsoft.com/office/word/2010/wordprocessingInk" xmlns:wne="http://schemas.microsoft.com/office/word/2006/wordml" xmlns:wps="http://schemas.microsoft.com/office/word/2010/wordprocessingShape" mc:Ignorable="w14 w15 w16se wp14">
   <w:abstractNum w:abstractNumId="0" w15:restartNumberingAfterBreak="0">
+    <w:nsid w:val="214B6A72"/>
+    <w:multiLevelType w:val="multilevel"/>
+    <w:tmpl w:val="DF5C8E24"/>
+    <w:lvl w:ilvl="0">
+      <w:start w:val="1"/>
+      <w:numFmt w:val="bullet"/>
+      <w:lvlText w:val=""/>
+      <w:lvlJc w:val="left"/>
+      <w:pPr>
+        <w:tabs>
+          <w:tab w:val="num" w:pos="720"/>
+        </w:tabs>
+        <w:ind w:left="720" w:hanging="360"/>
+      </w:pPr>
+      <w:rPr>
+        <w:rFonts w:ascii="Symbol" w:hAnsi="Symbol" w:hint="default"/>
+        <w:sz w:val="20"/>
+      </w:rPr>
+    </w:lvl>
+    <w:lvl w:ilvl="1" w:tentative="1">
+      <w:start w:val="1"/>
+      <w:numFmt w:val="bullet"/>
+      <w:lvlText w:val="o"/>
+      <w:lvlJc w:val="left"/>
+      <w:pPr>
+        <w:tabs>
+          <w:tab w:val="num" w:pos="1440"/>
+        </w:tabs>
+        <w:ind w:left="1440" w:hanging="360"/>
+      </w:pPr>
+      <w:rPr>
+        <w:rFonts w:ascii="Courier New" w:hAnsi="Courier New" w:hint="default"/>
+        <w:sz w:val="20"/>
+      </w:rPr>
+    </w:lvl>
+    <w:lvl w:ilvl="2" w:tentative="1">
+      <w:start w:val="1"/>
+      <w:numFmt w:val="bullet"/>
+      <w:lvlText w:val=""/>
+      <w:lvlJc w:val="left"/>
+      <w:pPr>
+        <w:tabs>
+          <w:tab w:val="num" w:pos="2160"/>
+        </w:tabs>
+        <w:ind w:left="2160" w:hanging="360"/>
+      </w:pPr>
+      <w:rPr>
+        <w:rFonts w:ascii="Wingdings" w:hAnsi="Wingdings" w:hint="default"/>
+        <w:sz w:val="20"/>
+      </w:rPr>
+    </w:lvl>
+    <w:lvl w:ilvl="3" w:tentative="1">
+      <w:start w:val="1"/>
+      <w:numFmt w:val="bullet"/>
+      <w:lvlText w:val=""/>
+      <w:lvlJc w:val="left"/>
+      <w:pPr>
+        <w:tabs>
+          <w:tab w:val="num" w:pos="2880"/>
+        </w:tabs>
+        <w:ind w:left="2880" w:hanging="360"/>
+      </w:pPr>
+      <w:rPr>
+        <w:rFonts w:ascii="Wingdings" w:hAnsi="Wingdings" w:hint="default"/>
+        <w:sz w:val="20"/>
+      </w:rPr>
+    </w:lvl>
+    <w:lvl w:ilvl="4" w:tentative="1">
+      <w:start w:val="1"/>
+      <w:numFmt w:val="bullet"/>
+      <w:lvlText w:val=""/>
+      <w:lvlJc w:val="left"/>
+      <w:pPr>
+        <w:tabs>
+          <w:tab w:val="num" w:pos="3600"/>
+        </w:tabs>
+        <w:ind w:left="3600" w:hanging="360"/>
+      </w:pPr>
+      <w:rPr>
+        <w:rFonts w:ascii="Wingdings" w:hAnsi="Wingdings" w:hint="default"/>
+        <w:sz w:val="20"/>
+      </w:rPr>
+    </w:lvl>
+    <w:lvl w:ilvl="5" w:tentative="1">
+      <w:start w:val="1"/>
+      <w:numFmt w:val="bullet"/>
+      <w:lvlText w:val=""/>
+      <w:lvlJc w:val="left"/>
+      <w:pPr>
+        <w:tabs>
+          <w:tab w:val="num" w:pos="4320"/>
+        </w:tabs>
+        <w:ind w:left="4320" w:hanging="360"/>
+      </w:pPr>
+      <w:rPr>
+        <w:rFonts w:ascii="Wingdings" w:hAnsi="Wingdings" w:hint="default"/>
+        <w:sz w:val="20"/>
+      </w:rPr>
+    </w:lvl>
+    <w:lvl w:ilvl="6" w:tentative="1">
+      <w:start w:val="1"/>
+      <w:numFmt w:val="bullet"/>
+      <w:lvlText w:val=""/>
+      <w:lvlJc w:val="left"/>
+      <w:pPr>
+        <w:tabs>
+          <w:tab w:val="num" w:pos="5040"/>
+        </w:tabs>
+        <w:ind w:left="5040" w:hanging="360"/>
+      </w:pPr>
+      <w:rPr>
+        <w:rFonts w:ascii="Wingdings" w:hAnsi="Wingdings" w:hint="default"/>
+        <w:sz w:val="20"/>
+      </w:rPr>
+    </w:lvl>
+    <w:lvl w:ilvl="7" w:tentative="1">
+      <w:start w:val="1"/>
+      <w:numFmt w:val="bullet"/>
+      <w:lvlText w:val=""/>
+      <w:lvlJc w:val="left"/>
+      <w:pPr>
+        <w:tabs>
+          <w:tab w:val="num" w:pos="5760"/>
+        </w:tabs>
+        <w:ind w:left="5760" w:hanging="360"/>
+      </w:pPr>
+      <w:rPr>
+        <w:rFonts w:ascii="Wingdings" w:hAnsi="Wingdings" w:hint="default"/>
+        <w:sz w:val="20"/>
+      </w:rPr>
+    </w:lvl>
+    <w:lvl w:ilvl="8" w:tentative="1">
+      <w:start w:val="1"/>
+      <w:numFmt w:val="bullet"/>
+      <w:lvlText w:val=""/>
+      <w:lvlJc w:val="left"/>
+      <w:pPr>
+        <w:tabs>
+          <w:tab w:val="num" w:pos="6480"/>
+        </w:tabs>
+        <w:ind w:left="6480" w:hanging="360"/>
+      </w:pPr>
+      <w:rPr>
+        <w:rFonts w:ascii="Wingdings" w:hAnsi="Wingdings" w:hint="default"/>
+        <w:sz w:val="20"/>
+      </w:rPr>
+    </w:lvl>
+  </w:abstractNum>
+  <w:abstractNum w:abstractNumId="1" w15:restartNumberingAfterBreak="0">
+    <w:nsid w:val="319847C7"/>
+    <w:multiLevelType w:val="multilevel"/>
+    <w:tmpl w:val="9FF4D8C0"/>
+    <w:lvl w:ilvl="0">
+      <w:start w:val="1"/>
+      <w:numFmt w:val="bullet"/>
+      <w:lvlText w:val=""/>
+      <w:lvlJc w:val="left"/>
+      <w:pPr>
+        <w:tabs>
+          <w:tab w:val="num" w:pos="720"/>
+        </w:tabs>
+        <w:ind w:left="720" w:hanging="360"/>
+      </w:pPr>
+      <w:rPr>
+        <w:rFonts w:ascii="Symbol" w:hAnsi="Symbol" w:hint="default"/>
+        <w:sz w:val="20"/>
+      </w:rPr>
+    </w:lvl>
+    <w:lvl w:ilvl="1" w:tentative="1">
+      <w:start w:val="1"/>
+      <w:numFmt w:val="bullet"/>
+      <w:lvlText w:val="o"/>
+      <w:lvlJc w:val="left"/>
+      <w:pPr>
+        <w:tabs>
+          <w:tab w:val="num" w:pos="1440"/>
+        </w:tabs>
+        <w:ind w:left="1440" w:hanging="360"/>
+      </w:pPr>
+      <w:rPr>
+        <w:rFonts w:ascii="Courier New" w:hAnsi="Courier New" w:hint="default"/>
+        <w:sz w:val="20"/>
+      </w:rPr>
+    </w:lvl>
+    <w:lvl w:ilvl="2" w:tentative="1">
+      <w:start w:val="1"/>
+      <w:numFmt w:val="bullet"/>
+      <w:lvlText w:val=""/>
+      <w:lvlJc w:val="left"/>
+      <w:pPr>
+        <w:tabs>
+          <w:tab w:val="num" w:pos="2160"/>
+        </w:tabs>
+        <w:ind w:left="2160" w:hanging="360"/>
+      </w:pPr>
+      <w:rPr>
+        <w:rFonts w:ascii="Wingdings" w:hAnsi="Wingdings" w:hint="default"/>
+        <w:sz w:val="20"/>
+      </w:rPr>
+    </w:lvl>
+    <w:lvl w:ilvl="3" w:tentative="1">
+      <w:start w:val="1"/>
+      <w:numFmt w:val="bullet"/>
+      <w:lvlText w:val=""/>
+      <w:lvlJc w:val="left"/>
+      <w:pPr>
+        <w:tabs>
+          <w:tab w:val="num" w:pos="2880"/>
+        </w:tabs>
+        <w:ind w:left="2880" w:hanging="360"/>
+      </w:pPr>
+      <w:rPr>
+        <w:rFonts w:ascii="Wingdings" w:hAnsi="Wingdings" w:hint="default"/>
+        <w:sz w:val="20"/>
+      </w:rPr>
+    </w:lvl>
+    <w:lvl w:ilvl="4" w:tentative="1">
+      <w:start w:val="1"/>
+      <w:numFmt w:val="bullet"/>
+      <w:lvlText w:val=""/>
+      <w:lvlJc w:val="left"/>
+      <w:pPr>
+        <w:tabs>
+          <w:tab w:val="num" w:pos="3600"/>
+        </w:tabs>
+        <w:ind w:left="3600" w:hanging="360"/>
+      </w:pPr>
+      <w:rPr>
+        <w:rFonts w:ascii="Wingdings" w:hAnsi="Wingdings" w:hint="default"/>
+        <w:sz w:val="20"/>
+      </w:rPr>
+    </w:lvl>
+    <w:lvl w:ilvl="5" w:tentative="1">
+      <w:start w:val="1"/>
+      <w:numFmt w:val="bullet"/>
+      <w:lvlText w:val=""/>
+      <w:lvlJc w:val="left"/>
+      <w:pPr>
+        <w:tabs>
+          <w:tab w:val="num" w:pos="4320"/>
+        </w:tabs>
+        <w:ind w:left="4320" w:hanging="360"/>
+      </w:pPr>
+      <w:rPr>
+        <w:rFonts w:ascii="Wingdings" w:hAnsi="Wingdings" w:hint="default"/>
+        <w:sz w:val="20"/>
+      </w:rPr>
+    </w:lvl>
+    <w:lvl w:ilvl="6" w:tentative="1">
+      <w:start w:val="1"/>
+      <w:numFmt w:val="bullet"/>
+      <w:lvlText w:val=""/>
+      <w:lvlJc w:val="left"/>
+      <w:pPr>
+        <w:tabs>
+          <w:tab w:val="num" w:pos="5040"/>
+        </w:tabs>
+        <w:ind w:left="5040" w:hanging="360"/>
+      </w:pPr>
+      <w:rPr>
+        <w:rFonts w:ascii="Wingdings" w:hAnsi="Wingdings" w:hint="default"/>
+        <w:sz w:val="20"/>
+      </w:rPr>
+    </w:lvl>
+    <w:lvl w:ilvl="7" w:tentative="1">
+      <w:start w:val="1"/>
+      <w:numFmt w:val="bullet"/>
+      <w:lvlText w:val=""/>
+      <w:lvlJc w:val="left"/>
+      <w:pPr>
+        <w:tabs>
+          <w:tab w:val="num" w:pos="5760"/>
+        </w:tabs>
+        <w:ind w:left="5760" w:hanging="360"/>
+      </w:pPr>
+      <w:rPr>
+        <w:rFonts w:ascii="Wingdings" w:hAnsi="Wingdings" w:hint="default"/>
+        <w:sz w:val="20"/>
+      </w:rPr>
+    </w:lvl>
+    <w:lvl w:ilvl="8" w:tentative="1">
+      <w:start w:val="1"/>
+      <w:numFmt w:val="bullet"/>
+      <w:lvlText w:val=""/>
+      <w:lvlJc w:val="left"/>
+      <w:pPr>
+        <w:tabs>
+          <w:tab w:val="num" w:pos="6480"/>
+        </w:tabs>
+        <w:ind w:left="6480" w:hanging="360"/>
+      </w:pPr>
+      <w:rPr>
+        <w:rFonts w:ascii="Wingdings" w:hAnsi="Wingdings" w:hint="default"/>
+        <w:sz w:val="20"/>
+      </w:rPr>
+    </w:lvl>
+  </w:abstractNum>
+  <w:abstractNum w:abstractNumId="2" w15:restartNumberingAfterBreak="0">
     <w:nsid w:val="731E28BF"/>
     <w:multiLevelType w:val="hybridMultilevel"/>
     <w:tmpl w:val="7742824C"/>
@@ -5391,7 +8078,13 @@
     </w:lvl>
   </w:abstractNum>
   <w:num w:numId="1">
+    <w:abstractNumId w:val="2"/>
+  </w:num>
+  <w:num w:numId="2">
     <w:abstractNumId w:val="0"/>
+  </w:num>
+  <w:num w:numId="3">
+    <w:abstractNumId w:val="1"/>
   </w:num>
 </w:numbering>
 </file>
@@ -5791,9 +8484,29 @@
     <w:qFormat/>
     <w:rsid w:val="00A56916"/>
   </w:style>
+  <w:style w:type="paragraph" w:styleId="Heading3">
+    <w:name w:val="heading 3"/>
+    <w:basedOn w:val="Normal"/>
+    <w:link w:val="Heading3Char"/>
+    <w:uiPriority w:val="9"/>
+    <w:qFormat/>
+    <w:rsid w:val="009E1F90"/>
+    <w:pPr>
+      <w:spacing w:before="100" w:beforeAutospacing="1" w:after="100" w:afterAutospacing="1" w:line="240" w:lineRule="auto"/>
+      <w:outlineLvl w:val="2"/>
+    </w:pPr>
+    <w:rPr>
+      <w:rFonts w:ascii="Times New Roman" w:eastAsia="Times New Roman" w:hAnsi="Times New Roman" w:cs="Times New Roman"/>
+      <w:b/>
+      <w:bCs/>
+      <w:sz w:val="27"/>
+      <w:szCs w:val="27"/>
+    </w:rPr>
+  </w:style>
   <w:style w:type="character" w:default="1" w:styleId="DefaultParagraphFont">
     <w:name w:val="Default Paragraph Font"/>
     <w:uiPriority w:val="1"/>
+    <w:semiHidden/>
     <w:unhideWhenUsed/>
   </w:style>
   <w:style w:type="table" w:default="1" w:styleId="TableNormal">
@@ -5843,6 +8556,112 @@
       <w:sz w:val="24"/>
       <w:szCs w:val="24"/>
     </w:rPr>
+  </w:style>
+  <w:style w:type="character" w:styleId="Strong">
+    <w:name w:val="Strong"/>
+    <w:basedOn w:val="DefaultParagraphFont"/>
+    <w:uiPriority w:val="22"/>
+    <w:qFormat/>
+    <w:rsid w:val="00E65BE2"/>
+    <w:rPr>
+      <w:b/>
+      <w:bCs/>
+    </w:rPr>
+  </w:style>
+  <w:style w:type="character" w:styleId="HTMLCode">
+    <w:name w:val="HTML Code"/>
+    <w:basedOn w:val="DefaultParagraphFont"/>
+    <w:uiPriority w:val="99"/>
+    <w:semiHidden/>
+    <w:unhideWhenUsed/>
+    <w:rsid w:val="009E1F90"/>
+    <w:rPr>
+      <w:rFonts w:ascii="Courier New" w:eastAsia="Times New Roman" w:hAnsi="Courier New" w:cs="Courier New"/>
+      <w:sz w:val="20"/>
+      <w:szCs w:val="20"/>
+    </w:rPr>
+  </w:style>
+  <w:style w:type="character" w:customStyle="1" w:styleId="Heading3Char">
+    <w:name w:val="Heading 3 Char"/>
+    <w:basedOn w:val="DefaultParagraphFont"/>
+    <w:link w:val="Heading3"/>
+    <w:uiPriority w:val="9"/>
+    <w:rsid w:val="009E1F90"/>
+    <w:rPr>
+      <w:rFonts w:ascii="Times New Roman" w:eastAsia="Times New Roman" w:hAnsi="Times New Roman" w:cs="Times New Roman"/>
+      <w:b/>
+      <w:bCs/>
+      <w:sz w:val="27"/>
+      <w:szCs w:val="27"/>
+    </w:rPr>
+  </w:style>
+  <w:style w:type="paragraph" w:styleId="HTMLPreformatted">
+    <w:name w:val="HTML Preformatted"/>
+    <w:basedOn w:val="Normal"/>
+    <w:link w:val="HTMLPreformattedChar"/>
+    <w:uiPriority w:val="99"/>
+    <w:semiHidden/>
+    <w:unhideWhenUsed/>
+    <w:rsid w:val="009E1F90"/>
+    <w:pPr>
+      <w:tabs>
+        <w:tab w:val="left" w:pos="916"/>
+        <w:tab w:val="left" w:pos="1832"/>
+        <w:tab w:val="left" w:pos="2748"/>
+        <w:tab w:val="left" w:pos="3664"/>
+        <w:tab w:val="left" w:pos="4580"/>
+        <w:tab w:val="left" w:pos="5496"/>
+        <w:tab w:val="left" w:pos="6412"/>
+        <w:tab w:val="left" w:pos="7328"/>
+        <w:tab w:val="left" w:pos="8244"/>
+        <w:tab w:val="left" w:pos="9160"/>
+        <w:tab w:val="left" w:pos="10076"/>
+        <w:tab w:val="left" w:pos="10992"/>
+        <w:tab w:val="left" w:pos="11908"/>
+        <w:tab w:val="left" w:pos="12824"/>
+        <w:tab w:val="left" w:pos="13740"/>
+        <w:tab w:val="left" w:pos="14656"/>
+      </w:tabs>
+      <w:spacing w:after="0" w:line="240" w:lineRule="auto"/>
+    </w:pPr>
+    <w:rPr>
+      <w:rFonts w:ascii="Courier New" w:eastAsia="Times New Roman" w:hAnsi="Courier New" w:cs="Courier New"/>
+      <w:sz w:val="20"/>
+      <w:szCs w:val="20"/>
+    </w:rPr>
+  </w:style>
+  <w:style w:type="character" w:customStyle="1" w:styleId="HTMLPreformattedChar">
+    <w:name w:val="HTML Preformatted Char"/>
+    <w:basedOn w:val="DefaultParagraphFont"/>
+    <w:link w:val="HTMLPreformatted"/>
+    <w:uiPriority w:val="99"/>
+    <w:semiHidden/>
+    <w:rsid w:val="009E1F90"/>
+    <w:rPr>
+      <w:rFonts w:ascii="Courier New" w:eastAsia="Times New Roman" w:hAnsi="Courier New" w:cs="Courier New"/>
+      <w:sz w:val="20"/>
+      <w:szCs w:val="20"/>
+    </w:rPr>
+  </w:style>
+  <w:style w:type="character" w:customStyle="1" w:styleId="t">
+    <w:name w:val="ͼt"/>
+    <w:basedOn w:val="DefaultParagraphFont"/>
+    <w:rsid w:val="009E1F90"/>
+  </w:style>
+  <w:style w:type="character" w:customStyle="1" w:styleId="r">
+    <w:name w:val="ͼr"/>
+    <w:basedOn w:val="DefaultParagraphFont"/>
+    <w:rsid w:val="009E1F90"/>
+  </w:style>
+  <w:style w:type="character" w:customStyle="1" w:styleId="n">
+    <w:name w:val="ͼn"/>
+    <w:basedOn w:val="DefaultParagraphFont"/>
+    <w:rsid w:val="009E1F90"/>
+  </w:style>
+  <w:style w:type="character" w:customStyle="1" w:styleId="q">
+    <w:name w:val="ͼq"/>
+    <w:basedOn w:val="DefaultParagraphFont"/>
+    <w:rsid w:val="009E1F90"/>
   </w:style>
 </w:styles>
 </file>

</xml_diff>